<commit_message>
Update report with NLLB analysis and paired significance test
Co-Authored-By: Claude Sonnet 5.5 <noreply@anthropic.com>
Claude-Session: https://claude.ai/code/session_01UYrEYjUDJ9qGLT4KnCv47t
</commit_message>
<xml_diff>
--- a/report/Laporan_MT_Evaluation_Mutaib_250820701100010.docx
+++ b/report/Laporan_MT_Evaluation_Mutaib_250820701100010.docx
@@ -1356,7 +1356,7 @@
           <w:sz w:val="24"/>
           <w:szCs w:val="24"/>
         </w:rPr>
-        <w:t xml:space="preserve">NLLB is ahead of MarianMT on every metric: about 3 points on BLEU-1 to BLEU-4, 2.7 points on chrF and 4.4 points lower on TER. The bootstrap intervals in Table 2 show that this lead should be read with care.</w:t>
+        <w:t xml:space="preserve">NLLB is ahead of MarianMT on every metric: about 3 points on BLEU-1 to BLEU-4, 2.7 points on chrF and 4.4 points lower on TER. Table 2 gives the bootstrap intervals for each system.</w:t>
       </w:r>
     </w:p>
     <w:tbl>
@@ -2837,7 +2837,43 @@
           <w:sz w:val="24"/>
           <w:szCs w:val="24"/>
         </w:rPr>
-        <w:t xml:space="preserve">The intervals of the two systems overlap on every metric shown (for BLEU-4, 33.6–39.2 against 36.3–42.5). Both systems were scored on the same 200 sentences, so a paired comparison would be sharper than comparing two separate intervals, and that test was not run here. With this sample, the safe statement is that NLLB is consistently somewhat better, not that the gap is established. A larger sample would settle it.</w:t>
+        <w:t xml:space="preserve">Each system’s own interval is fairly wide, and the two overlap (for BLEU-4, 33.6–39.2 against 36.3–42.5). Overlapping separate intervals do not rule out a real difference, because both systems were scored on the same 200 sentences. A paired bootstrap that resamples sentences once and scores both systems on the same resample is the better test. It gives a BLEU-4 advantage for NLLB of </w:t>
+      </w:r>
+      <w:r>
+        <w:rPr>
+          <w:rFonts w:ascii="Times New Roman" w:cs="Times New Roman" w:eastAsia="Times New Roman" w:hAnsi="Times New Roman"/>
+          <w:b/>
+          <w:bCs/>
+          <w:sz w:val="24"/>
+          <w:szCs w:val="24"/>
+        </w:rPr>
+        <w:t xml:space="preserve">2.90 points (95% CI 0.94 to 4.66)</w:t>
+      </w:r>
+      <w:r>
+        <w:rPr>
+          <w:rFonts w:ascii="Times New Roman" w:cs="Times New Roman" w:eastAsia="Times New Roman" w:hAnsi="Times New Roman"/>
+          <w:sz w:val="24"/>
+          <w:szCs w:val="24"/>
+        </w:rPr>
+        <w:t xml:space="preserve"> and a chrF advantage of </w:t>
+      </w:r>
+      <w:r>
+        <w:rPr>
+          <w:rFonts w:ascii="Times New Roman" w:cs="Times New Roman" w:eastAsia="Times New Roman" w:hAnsi="Times New Roman"/>
+          <w:b/>
+          <w:bCs/>
+          <w:sz w:val="24"/>
+          <w:szCs w:val="24"/>
+        </w:rPr>
+        <w:t xml:space="preserve">2.67 points (95% CI 1.39 to 3.89)</w:t>
+      </w:r>
+      <w:r>
+        <w:rPr>
+          <w:rFonts w:ascii="Times New Roman" w:cs="Times New Roman" w:eastAsia="Times New Roman" w:hAnsi="Times New Roman"/>
+          <w:sz w:val="24"/>
+          <w:szCs w:val="24"/>
+        </w:rPr>
+        <w:t xml:space="preserve">. Neither interval includes zero, so on this sample NLLB is better than MarianMT on both metrics, although the size of the BLEU-4 gap is uncertain (roughly 1 to 5 points). The paired test was run for BLEU-4 and chrF only.</w:t>
       </w:r>
     </w:p>
     <w:p>
@@ -3924,7 +3960,7 @@
           <w:sz w:val="24"/>
           <w:szCs w:val="24"/>
         </w:rPr>
-        <w:t xml:space="preserve">The 10 lowest-scoring sentences (with at least six words) were taken for MarianMT, ranked by the combined rank of sentence-level BLEU and chrF. All 10 are analysed below. Each was read against its reference and classified by linguistic phenomenon. Section 5.2 adds examples from both systems that illustrate other phenomena. Sentence numbers are the identifiers in the FLORES file.</w:t>
+        <w:t xml:space="preserve">The 10 lowest-scoring sentences (with at least six words) were taken for MarianMT, ranked by the combined rank of sentence-level BLEU and chrF. All 10 are analysed below. Each was read against its reference and classified by linguistic phenomenon. Sections 5.3 and 5.4 add further examples from both systems and the ten lowest-scoring NLLB sentences. Sentence numbers are the identifiers in the FLORES file.</w:t>
       </w:r>
     </w:p>
     <w:p>
@@ -8923,7 +8959,7 @@
           <w:sz w:val="24"/>
           <w:szCs w:val="24"/>
         </w:rPr>
-        <w:t xml:space="preserve">The most striking pattern is omission. In five of the ten sentences the input contained two or three sentences, and MarianMT translated only some of them. All five of those inputs were multi-sentence lines, which suggests that the model, trained mostly on single sentences, does not reliably handle several sentences at once. This is an observation about this sample and not a measured rate, but it matters for evaluation: the quickest way to improve these scores would be to translate each sentence separately before scoring, and this is a processing issue rather than a limitation of the Indonesian output itself.</w:t>
+        <w:t xml:space="preserve">The most striking pattern is omission. In five of the ten sentences the input contained two or three sentences, and MarianMT translated only some of them. This is not limited to the worst ten. Only 29 of the 200 test inputs contain more than one sentence, but MarianMT’s output is shorter than 75% of the reference length for 12 of those 29 (41%), against 5 of the remaining 171 single-sentence inputs (3%). Their average length ratio (output words divided by reference words) is 0.80 for the multi-sentence inputs and 1.01 for the single-sentence ones. NLLB shows the same weakness more mildly: 5 of 29 multi-sentence inputs are shorter than 75% of the reference, and the average ratio is 0.91. A likely reason is that these models were trained mostly on single sentences. It matters for evaluation because splitting the input into sentences before translating would probably remove a large part of the low scores, and this is a processing issue and not a limitation of the Indonesian output itself.</w:t>
       </w:r>
     </w:p>
     <w:p>
@@ -10774,6 +10810,22 @@
     </w:p>
     <w:p>
       <w:pPr>
+        <w:pStyle w:val="Heading2"/>
+        <w:spacing w:after="100" w:before="220"/>
+      </w:pPr>
+      <w:r>
+        <w:rPr>
+          <w:rFonts w:ascii="Times New Roman" w:cs="Times New Roman" w:eastAsia="Times New Roman" w:hAnsi="Times New Roman"/>
+          <w:b/>
+          <w:bCs/>
+          <w:sz w:val="25"/>
+          <w:szCs w:val="25"/>
+        </w:rPr>
+        <w:t xml:space="preserve">5.4 The ten lowest-scoring NLLB sentences</w:t>
+      </w:r>
+    </w:p>
+    <w:p>
+      <w:pPr>
         <w:spacing w:after="120" w:line="300"/>
         <w:jc w:val="both"/>
       </w:pPr>
@@ -10783,7 +10835,2349 @@
           <w:sz w:val="24"/>
           <w:szCs w:val="24"/>
         </w:rPr>
-        <w:t xml:space="preserve">The analysis of NLLB’s own ten lowest sentences is not included in this version. Only the MarianMT list was worked through in full. In the sentences that appeared on both lists (for example 355 and 1495), NLLB’s scores are as low as Marian’s, so the weak spots are shared.</w:t>
+        <w:t xml:space="preserve">The same selection was made for NLLB (Table 6). Sentences 355 and 1495 are also on the MarianMT list and were discussed in Section 5.1; NLLB makes the same </w:t>
+      </w:r>
+      <w:r>
+        <w:rPr>
+          <w:rFonts w:ascii="Times New Roman" w:cs="Times New Roman" w:eastAsia="Times New Roman" w:hAnsi="Times New Roman"/>
+          <w:i/>
+          <w:iCs/>
+          <w:sz w:val="24"/>
+          <w:szCs w:val="24"/>
+        </w:rPr>
+        <w:t xml:space="preserve">pisau</w:t>
+      </w:r>
+      <w:r>
+        <w:rPr>
+          <w:rFonts w:ascii="Times New Roman" w:cs="Times New Roman" w:eastAsia="Times New Roman" w:hAnsi="Times New Roman"/>
+          <w:sz w:val="24"/>
+          <w:szCs w:val="24"/>
+        </w:rPr>
+        <w:t xml:space="preserve"> (blade) and </w:t>
+      </w:r>
+      <w:r>
+        <w:rPr>
+          <w:rFonts w:ascii="Times New Roman" w:cs="Times New Roman" w:eastAsia="Times New Roman" w:hAnsi="Times New Roman"/>
+          <w:i/>
+          <w:iCs/>
+          <w:sz w:val="24"/>
+          <w:szCs w:val="24"/>
+        </w:rPr>
+        <w:t xml:space="preserve">skate</w:t>
+      </w:r>
+      <w:r>
+        <w:rPr>
+          <w:rFonts w:ascii="Times New Roman" w:cs="Times New Roman" w:eastAsia="Times New Roman" w:hAnsi="Times New Roman"/>
+          <w:sz w:val="24"/>
+          <w:szCs w:val="24"/>
+        </w:rPr>
+        <w:t xml:space="preserve"> errors in 355, and in 1495 it writes </w:t>
+      </w:r>
+      <w:r>
+        <w:rPr>
+          <w:rFonts w:ascii="Times New Roman" w:cs="Times New Roman" w:eastAsia="Times New Roman" w:hAnsi="Times New Roman"/>
+          <w:i/>
+          <w:iCs/>
+          <w:sz w:val="24"/>
+          <w:szCs w:val="24"/>
+        </w:rPr>
+        <w:t xml:space="preserve">susistensi</w:t>
+      </w:r>
+      <w:r>
+        <w:rPr>
+          <w:rFonts w:ascii="Times New Roman" w:cs="Times New Roman" w:eastAsia="Times New Roman" w:hAnsi="Times New Roman"/>
+          <w:sz w:val="24"/>
+          <w:szCs w:val="24"/>
+        </w:rPr>
+        <w:t xml:space="preserve"> (a misspelling of </w:t>
+      </w:r>
+      <w:r>
+        <w:rPr>
+          <w:rFonts w:ascii="Times New Roman" w:cs="Times New Roman" w:eastAsia="Times New Roman" w:hAnsi="Times New Roman"/>
+          <w:i/>
+          <w:iCs/>
+          <w:sz w:val="24"/>
+          <w:szCs w:val="24"/>
+        </w:rPr>
+        <w:t xml:space="preserve">subsistensi</w:t>
+      </w:r>
+      <w:r>
+        <w:rPr>
+          <w:rFonts w:ascii="Times New Roman" w:cs="Times New Roman" w:eastAsia="Times New Roman" w:hAnsi="Times New Roman"/>
+          <w:sz w:val="24"/>
+          <w:szCs w:val="24"/>
+        </w:rPr>
+        <w:t xml:space="preserve">) where the reference has </w:t>
+      </w:r>
+      <w:r>
+        <w:rPr>
+          <w:rFonts w:ascii="Times New Roman" w:cs="Times New Roman" w:eastAsia="Times New Roman" w:hAnsi="Times New Roman"/>
+          <w:i/>
+          <w:iCs/>
+          <w:sz w:val="24"/>
+          <w:szCs w:val="24"/>
+        </w:rPr>
+        <w:t xml:space="preserve">subsisten</w:t>
+      </w:r>
+      <w:r>
+        <w:rPr>
+          <w:rFonts w:ascii="Times New Roman" w:cs="Times New Roman" w:eastAsia="Times New Roman" w:hAnsi="Times New Roman"/>
+          <w:sz w:val="24"/>
+          <w:szCs w:val="24"/>
+        </w:rPr>
+        <w:t xml:space="preserve">.</w:t>
+      </w:r>
+    </w:p>
+    <w:tbl>
+      <w:tblPr>
+        <w:tblW w:type="dxa" w:w="9026"/>
+        <w:tblBorders>
+          <w:top w:val="single" w:color="auto" w:sz="4"/>
+          <w:left w:val="single" w:color="auto" w:sz="4"/>
+          <w:bottom w:val="single" w:color="auto" w:sz="4"/>
+          <w:right w:val="single" w:color="auto" w:sz="4"/>
+          <w:insideH w:val="single" w:color="auto" w:sz="4"/>
+          <w:insideV w:val="single" w:color="auto" w:sz="4"/>
+        </w:tblBorders>
+      </w:tblPr>
+      <w:tblGrid>
+        <w:gridCol w:w="700"/>
+        <w:gridCol w:w="4100"/>
+        <w:gridCol w:w="4226"/>
+      </w:tblGrid>
+      <w:tr>
+        <w:trPr>
+          <w:tblHeader/>
+        </w:trPr>
+        <w:tc>
+          <w:tcPr>
+            <w:tcW w:type="dxa" w:w="700"/>
+            <w:tcBorders>
+              <w:top w:val="single" w:color="999999" w:sz="4"/>
+              <w:left w:val="single" w:color="999999" w:sz="4"/>
+              <w:bottom w:val="single" w:color="999999" w:sz="4"/>
+              <w:right w:val="single" w:color="999999" w:sz="4"/>
+            </w:tcBorders>
+            <w:shd w:fill="D9E2F3" w:color="auto" w:val="clear"/>
+            <w:tcMar>
+              <w:top w:type="dxa" w:w="60"/>
+              <w:left w:type="dxa" w:w="100"/>
+              <w:bottom w:type="dxa" w:w="60"/>
+              <w:right w:type="dxa" w:w="100"/>
+            </w:tcMar>
+          </w:tcPr>
+          <w:p>
+            <w:pPr>
+              <w:spacing w:after="0"/>
+              <w:jc w:val="left"/>
+            </w:pPr>
+            <w:r>
+              <w:rPr>
+                <w:rFonts w:ascii="Times New Roman" w:cs="Times New Roman" w:eastAsia="Times New Roman" w:hAnsi="Times New Roman"/>
+                <w:b/>
+                <w:bCs/>
+                <w:sz w:val="21"/>
+                <w:szCs w:val="21"/>
+              </w:rPr>
+              <w:t xml:space="preserve">ID</w:t>
+            </w:r>
+          </w:p>
+        </w:tc>
+        <w:tc>
+          <w:tcPr>
+            <w:tcW w:type="dxa" w:w="4100"/>
+            <w:tcBorders>
+              <w:top w:val="single" w:color="999999" w:sz="4"/>
+              <w:left w:val="single" w:color="999999" w:sz="4"/>
+              <w:bottom w:val="single" w:color="999999" w:sz="4"/>
+              <w:right w:val="single" w:color="999999" w:sz="4"/>
+            </w:tcBorders>
+            <w:shd w:fill="D9E2F3" w:color="auto" w:val="clear"/>
+            <w:tcMar>
+              <w:top w:type="dxa" w:w="60"/>
+              <w:left w:type="dxa" w:w="100"/>
+              <w:bottom w:type="dxa" w:w="60"/>
+              <w:right w:type="dxa" w:w="100"/>
+            </w:tcMar>
+          </w:tcPr>
+          <w:p>
+            <w:pPr>
+              <w:spacing w:after="0"/>
+              <w:jc w:val="center"/>
+            </w:pPr>
+            <w:r>
+              <w:rPr>
+                <w:rFonts w:ascii="Times New Roman" w:cs="Times New Roman" w:eastAsia="Times New Roman" w:hAnsi="Times New Roman"/>
+                <w:b/>
+                <w:bCs/>
+                <w:sz w:val="21"/>
+                <w:szCs w:val="21"/>
+              </w:rPr>
+              <w:t xml:space="preserve">What happens (reference vs NLLB)</w:t>
+            </w:r>
+          </w:p>
+        </w:tc>
+        <w:tc>
+          <w:tcPr>
+            <w:tcW w:type="dxa" w:w="4226"/>
+            <w:tcBorders>
+              <w:top w:val="single" w:color="999999" w:sz="4"/>
+              <w:left w:val="single" w:color="999999" w:sz="4"/>
+              <w:bottom w:val="single" w:color="999999" w:sz="4"/>
+              <w:right w:val="single" w:color="999999" w:sz="4"/>
+            </w:tcBorders>
+            <w:shd w:fill="D9E2F3" w:color="auto" w:val="clear"/>
+            <w:tcMar>
+              <w:top w:type="dxa" w:w="60"/>
+              <w:left w:type="dxa" w:w="100"/>
+              <w:bottom w:type="dxa" w:w="60"/>
+              <w:right w:type="dxa" w:w="100"/>
+            </w:tcMar>
+          </w:tcPr>
+          <w:p>
+            <w:pPr>
+              <w:spacing w:after="0"/>
+              <w:jc w:val="center"/>
+            </w:pPr>
+            <w:r>
+              <w:rPr>
+                <w:rFonts w:ascii="Times New Roman" w:cs="Times New Roman" w:eastAsia="Times New Roman" w:hAnsi="Times New Roman"/>
+                <w:b/>
+                <w:bCs/>
+                <w:sz w:val="21"/>
+                <w:szCs w:val="21"/>
+              </w:rPr>
+              <w:t xml:space="preserve">Phenomenon</w:t>
+            </w:r>
+          </w:p>
+        </w:tc>
+      </w:tr>
+      <w:tr>
+        <w:tc>
+          <w:tcPr>
+            <w:tcW w:type="dxa" w:w="700"/>
+            <w:tcBorders>
+              <w:top w:val="single" w:color="999999" w:sz="4"/>
+              <w:left w:val="single" w:color="999999" w:sz="4"/>
+              <w:bottom w:val="single" w:color="999999" w:sz="4"/>
+              <w:right w:val="single" w:color="999999" w:sz="4"/>
+            </w:tcBorders>
+            <w:tcMar>
+              <w:top w:type="dxa" w:w="60"/>
+              <w:left w:type="dxa" w:w="100"/>
+              <w:bottom w:type="dxa" w:w="60"/>
+              <w:right w:type="dxa" w:w="100"/>
+            </w:tcMar>
+          </w:tcPr>
+          <w:p>
+            <w:pPr>
+              <w:spacing w:after="0"/>
+              <w:jc w:val="left"/>
+            </w:pPr>
+            <w:r>
+              <w:rPr>
+                <w:rFonts w:ascii="Times New Roman" w:cs="Times New Roman" w:eastAsia="Times New Roman" w:hAnsi="Times New Roman"/>
+                <w:sz w:val="21"/>
+                <w:szCs w:val="21"/>
+              </w:rPr>
+              <w:t xml:space="preserve">355</w:t>
+            </w:r>
+          </w:p>
+        </w:tc>
+        <w:tc>
+          <w:tcPr>
+            <w:tcW w:type="dxa" w:w="4100"/>
+            <w:tcBorders>
+              <w:top w:val="single" w:color="999999" w:sz="4"/>
+              <w:left w:val="single" w:color="999999" w:sz="4"/>
+              <w:bottom w:val="single" w:color="999999" w:sz="4"/>
+              <w:right w:val="single" w:color="999999" w:sz="4"/>
+            </w:tcBorders>
+            <w:tcMar>
+              <w:top w:type="dxa" w:w="60"/>
+              <w:left w:type="dxa" w:w="100"/>
+              <w:bottom w:type="dxa" w:w="60"/>
+              <w:right w:type="dxa" w:w="100"/>
+            </w:tcMar>
+          </w:tcPr>
+          <w:p>
+            <w:pPr>
+              <w:spacing w:after="0"/>
+              <w:jc w:val="left"/>
+            </w:pPr>
+            <w:r>
+              <w:rPr>
+                <w:rFonts w:ascii="Times New Roman" w:cs="Times New Roman" w:eastAsia="Times New Roman" w:hAnsi="Times New Roman"/>
+                <w:sz w:val="21"/>
+                <w:szCs w:val="21"/>
+              </w:rPr>
+              <w:t xml:space="preserve">Reference </w:t>
+            </w:r>
+            <w:r>
+              <w:rPr>
+                <w:rFonts w:ascii="Times New Roman" w:cs="Times New Roman" w:eastAsia="Times New Roman" w:hAnsi="Times New Roman"/>
+                <w:i/>
+                <w:iCs/>
+                <w:sz w:val="21"/>
+                <w:szCs w:val="21"/>
+              </w:rPr>
+              <w:t xml:space="preserve">Bilah … seluncur es … cekungan kosong diantaranya</w:t>
+            </w:r>
+            <w:r>
+              <w:rPr>
+                <w:rFonts w:ascii="Times New Roman" w:cs="Times New Roman" w:eastAsia="Times New Roman" w:hAnsi="Times New Roman"/>
+                <w:sz w:val="21"/>
+                <w:szCs w:val="21"/>
+              </w:rPr>
+              <w:t xml:space="preserve">; NLLB </w:t>
+            </w:r>
+            <w:r>
+              <w:rPr>
+                <w:rFonts w:ascii="Times New Roman" w:cs="Times New Roman" w:eastAsia="Times New Roman" w:hAnsi="Times New Roman"/>
+                <w:i/>
+                <w:iCs/>
+                <w:sz w:val="21"/>
+                <w:szCs w:val="21"/>
+              </w:rPr>
+              <w:t xml:space="preserve">Pisau … skate es … lubang konkaf di antara keduanya</w:t>
+            </w:r>
+            <w:r>
+              <w:rPr>
+                <w:rFonts w:ascii="Times New Roman" w:cs="Times New Roman" w:eastAsia="Times New Roman" w:hAnsi="Times New Roman"/>
+                <w:sz w:val="21"/>
+                <w:szCs w:val="21"/>
+              </w:rPr>
+              <w:t xml:space="preserve">. The second sentence is dropped.</w:t>
+            </w:r>
+          </w:p>
+        </w:tc>
+        <w:tc>
+          <w:tcPr>
+            <w:tcW w:type="dxa" w:w="4226"/>
+            <w:tcBorders>
+              <w:top w:val="single" w:color="999999" w:sz="4"/>
+              <w:left w:val="single" w:color="999999" w:sz="4"/>
+              <w:bottom w:val="single" w:color="999999" w:sz="4"/>
+              <w:right w:val="single" w:color="999999" w:sz="4"/>
+            </w:tcBorders>
+            <w:tcMar>
+              <w:top w:type="dxa" w:w="60"/>
+              <w:left w:type="dxa" w:w="100"/>
+              <w:bottom w:type="dxa" w:w="60"/>
+              <w:right w:type="dxa" w:w="100"/>
+            </w:tcMar>
+          </w:tcPr>
+          <w:p>
+            <w:pPr>
+              <w:spacing w:after="0"/>
+              <w:jc w:val="left"/>
+            </w:pPr>
+            <w:r>
+              <w:rPr>
+                <w:rFonts w:ascii="Times New Roman" w:cs="Times New Roman" w:eastAsia="Times New Roman" w:hAnsi="Times New Roman"/>
+                <w:sz w:val="21"/>
+                <w:szCs w:val="21"/>
+              </w:rPr>
+              <w:t xml:space="preserve">Polysemy (</w:t>
+            </w:r>
+            <w:r>
+              <w:rPr>
+                <w:rFonts w:ascii="Times New Roman" w:cs="Times New Roman" w:eastAsia="Times New Roman" w:hAnsi="Times New Roman"/>
+                <w:i/>
+                <w:iCs/>
+                <w:sz w:val="21"/>
+                <w:szCs w:val="21"/>
+              </w:rPr>
+              <w:t xml:space="preserve">blade</w:t>
+            </w:r>
+            <w:r>
+              <w:rPr>
+                <w:rFonts w:ascii="Times New Roman" w:cs="Times New Roman" w:eastAsia="Times New Roman" w:hAnsi="Times New Roman"/>
+                <w:sz w:val="21"/>
+                <w:szCs w:val="21"/>
+              </w:rPr>
+              <w:t xml:space="preserve">), lexical gap (</w:t>
+            </w:r>
+            <w:r>
+              <w:rPr>
+                <w:rFonts w:ascii="Times New Roman" w:cs="Times New Roman" w:eastAsia="Times New Roman" w:hAnsi="Times New Roman"/>
+                <w:i/>
+                <w:iCs/>
+                <w:sz w:val="21"/>
+                <w:szCs w:val="21"/>
+              </w:rPr>
+              <w:t xml:space="preserve">ice skate</w:t>
+            </w:r>
+            <w:r>
+              <w:rPr>
+                <w:rFonts w:ascii="Times New Roman" w:cs="Times New Roman" w:eastAsia="Times New Roman" w:hAnsi="Times New Roman"/>
+                <w:sz w:val="21"/>
+                <w:szCs w:val="21"/>
+              </w:rPr>
+              <w:t xml:space="preserve">), omission. Using </w:t>
+            </w:r>
+            <w:r>
+              <w:rPr>
+                <w:rFonts w:ascii="Times New Roman" w:cs="Times New Roman" w:eastAsia="Times New Roman" w:hAnsi="Times New Roman"/>
+                <w:i/>
+                <w:iCs/>
+                <w:sz w:val="21"/>
+                <w:szCs w:val="21"/>
+              </w:rPr>
+              <w:t xml:space="preserve">keduanya</w:t>
+            </w:r>
+            <w:r>
+              <w:rPr>
+                <w:rFonts w:ascii="Times New Roman" w:cs="Times New Roman" w:eastAsia="Times New Roman" w:hAnsi="Times New Roman"/>
+                <w:sz w:val="21"/>
+                <w:szCs w:val="21"/>
+              </w:rPr>
+              <w:t xml:space="preserve"> for “the two of them” is better than Marian’s </w:t>
+            </w:r>
+            <w:r>
+              <w:rPr>
+                <w:rFonts w:ascii="Times New Roman" w:cs="Times New Roman" w:eastAsia="Times New Roman" w:hAnsi="Times New Roman"/>
+                <w:i/>
+                <w:iCs/>
+                <w:sz w:val="21"/>
+                <w:szCs w:val="21"/>
+              </w:rPr>
+              <w:t xml:space="preserve">mereka</w:t>
+            </w:r>
+            <w:r>
+              <w:rPr>
+                <w:rFonts w:ascii="Times New Roman" w:cs="Times New Roman" w:eastAsia="Times New Roman" w:hAnsi="Times New Roman"/>
+                <w:sz w:val="21"/>
+                <w:szCs w:val="21"/>
+              </w:rPr>
+              <w:t xml:space="preserve">.</w:t>
+            </w:r>
+          </w:p>
+        </w:tc>
+      </w:tr>
+      <w:tr>
+        <w:tc>
+          <w:tcPr>
+            <w:tcW w:type="dxa" w:w="700"/>
+            <w:tcBorders>
+              <w:top w:val="single" w:color="999999" w:sz="4"/>
+              <w:left w:val="single" w:color="999999" w:sz="4"/>
+              <w:bottom w:val="single" w:color="999999" w:sz="4"/>
+              <w:right w:val="single" w:color="999999" w:sz="4"/>
+            </w:tcBorders>
+            <w:tcMar>
+              <w:top w:type="dxa" w:w="60"/>
+              <w:left w:type="dxa" w:w="100"/>
+              <w:bottom w:type="dxa" w:w="60"/>
+              <w:right w:type="dxa" w:w="100"/>
+            </w:tcMar>
+          </w:tcPr>
+          <w:p>
+            <w:pPr>
+              <w:spacing w:after="0"/>
+              <w:jc w:val="left"/>
+            </w:pPr>
+            <w:r>
+              <w:rPr>
+                <w:rFonts w:ascii="Times New Roman" w:cs="Times New Roman" w:eastAsia="Times New Roman" w:hAnsi="Times New Roman"/>
+                <w:sz w:val="21"/>
+                <w:szCs w:val="21"/>
+              </w:rPr>
+              <w:t xml:space="preserve">1042</w:t>
+            </w:r>
+          </w:p>
+        </w:tc>
+        <w:tc>
+          <w:tcPr>
+            <w:tcW w:type="dxa" w:w="4100"/>
+            <w:tcBorders>
+              <w:top w:val="single" w:color="999999" w:sz="4"/>
+              <w:left w:val="single" w:color="999999" w:sz="4"/>
+              <w:bottom w:val="single" w:color="999999" w:sz="4"/>
+              <w:right w:val="single" w:color="999999" w:sz="4"/>
+            </w:tcBorders>
+            <w:tcMar>
+              <w:top w:type="dxa" w:w="60"/>
+              <w:left w:type="dxa" w:w="100"/>
+              <w:bottom w:type="dxa" w:w="60"/>
+              <w:right w:type="dxa" w:w="100"/>
+            </w:tcMar>
+          </w:tcPr>
+          <w:p>
+            <w:pPr>
+              <w:spacing w:after="0"/>
+              <w:jc w:val="left"/>
+            </w:pPr>
+            <w:r>
+              <w:rPr>
+                <w:rFonts w:ascii="Times New Roman" w:cs="Times New Roman" w:eastAsia="Times New Roman" w:hAnsi="Times New Roman"/>
+                <w:sz w:val="21"/>
+                <w:szCs w:val="21"/>
+              </w:rPr>
+              <w:t xml:space="preserve">Source: </w:t>
+            </w:r>
+            <w:r>
+              <w:rPr>
+                <w:rFonts w:ascii="Times New Roman" w:cs="Times New Roman" w:eastAsia="Times New Roman" w:hAnsi="Times New Roman"/>
+                <w:i/>
+                <w:iCs/>
+                <w:sz w:val="21"/>
+                <w:szCs w:val="21"/>
+              </w:rPr>
+              <w:t xml:space="preserve">Duvall, who is married with two adult children, did not leave a big impression on Miller, to whom the story was related.</w:t>
+            </w:r>
+            <w:r>
+              <w:rPr>
+                <w:rFonts w:ascii="Times New Roman" w:cs="Times New Roman" w:eastAsia="Times New Roman" w:hAnsi="Times New Roman"/>
+                <w:sz w:val="21"/>
+                <w:szCs w:val="21"/>
+              </w:rPr>
+              <w:t xml:space="preserve"> NLLB says </w:t>
+            </w:r>
+            <w:r>
+              <w:rPr>
+                <w:rFonts w:ascii="Times New Roman" w:cs="Times New Roman" w:eastAsia="Times New Roman" w:hAnsi="Times New Roman"/>
+                <w:i/>
+                <w:iCs/>
+                <w:sz w:val="21"/>
+                <w:szCs w:val="21"/>
+              </w:rPr>
+              <w:t xml:space="preserve">Miller, yang menceritakan kisahnya</w:t>
+            </w:r>
+            <w:r>
+              <w:rPr>
+                <w:rFonts w:ascii="Times New Roman" w:cs="Times New Roman" w:eastAsia="Times New Roman" w:hAnsi="Times New Roman"/>
+                <w:sz w:val="21"/>
+                <w:szCs w:val="21"/>
+              </w:rPr>
+              <w:t xml:space="preserve"> (“Miller, who told the story”).</w:t>
+            </w:r>
+          </w:p>
+        </w:tc>
+        <w:tc>
+          <w:tcPr>
+            <w:tcW w:type="dxa" w:w="4226"/>
+            <w:tcBorders>
+              <w:top w:val="single" w:color="999999" w:sz="4"/>
+              <w:left w:val="single" w:color="999999" w:sz="4"/>
+              <w:bottom w:val="single" w:color="999999" w:sz="4"/>
+              <w:right w:val="single" w:color="999999" w:sz="4"/>
+            </w:tcBorders>
+            <w:tcMar>
+              <w:top w:type="dxa" w:w="60"/>
+              <w:left w:type="dxa" w:w="100"/>
+              <w:bottom w:type="dxa" w:w="60"/>
+              <w:right w:type="dxa" w:w="100"/>
+            </w:tcMar>
+          </w:tcPr>
+          <w:p>
+            <w:pPr>
+              <w:spacing w:after="0"/>
+              <w:jc w:val="left"/>
+            </w:pPr>
+            <w:r>
+              <w:rPr>
+                <w:rFonts w:ascii="Times New Roman" w:cs="Times New Roman" w:eastAsia="Times New Roman" w:hAnsi="Times New Roman"/>
+                <w:sz w:val="21"/>
+                <w:szCs w:val="21"/>
+              </w:rPr>
+              <w:t xml:space="preserve">Wrong relative-clause attachment: </w:t>
+            </w:r>
+            <w:r>
+              <w:rPr>
+                <w:rFonts w:ascii="Times New Roman" w:cs="Times New Roman" w:eastAsia="Times New Roman" w:hAnsi="Times New Roman"/>
+                <w:i/>
+                <w:iCs/>
+                <w:sz w:val="21"/>
+                <w:szCs w:val="21"/>
+              </w:rPr>
+              <w:t xml:space="preserve">to whom the story was related</w:t>
+            </w:r>
+            <w:r>
+              <w:rPr>
+                <w:rFonts w:ascii="Times New Roman" w:cs="Times New Roman" w:eastAsia="Times New Roman" w:hAnsi="Times New Roman"/>
+                <w:sz w:val="21"/>
+                <w:szCs w:val="21"/>
+              </w:rPr>
+              <w:t xml:space="preserve"> means the story was told to Miller, but the output makes Miller the teller (agent and recipient reversed). The first clause is translated well and differs from the reference only in wording.</w:t>
+            </w:r>
+          </w:p>
+        </w:tc>
+      </w:tr>
+      <w:tr>
+        <w:tc>
+          <w:tcPr>
+            <w:tcW w:type="dxa" w:w="700"/>
+            <w:tcBorders>
+              <w:top w:val="single" w:color="999999" w:sz="4"/>
+              <w:left w:val="single" w:color="999999" w:sz="4"/>
+              <w:bottom w:val="single" w:color="999999" w:sz="4"/>
+              <w:right w:val="single" w:color="999999" w:sz="4"/>
+            </w:tcBorders>
+            <w:tcMar>
+              <w:top w:type="dxa" w:w="60"/>
+              <w:left w:type="dxa" w:w="100"/>
+              <w:bottom w:type="dxa" w:w="60"/>
+              <w:right w:type="dxa" w:w="100"/>
+            </w:tcMar>
+          </w:tcPr>
+          <w:p>
+            <w:pPr>
+              <w:spacing w:after="0"/>
+              <w:jc w:val="left"/>
+            </w:pPr>
+            <w:r>
+              <w:rPr>
+                <w:rFonts w:ascii="Times New Roman" w:cs="Times New Roman" w:eastAsia="Times New Roman" w:hAnsi="Times New Roman"/>
+                <w:sz w:val="21"/>
+                <w:szCs w:val="21"/>
+              </w:rPr>
+              <w:t xml:space="preserve">533</w:t>
+            </w:r>
+          </w:p>
+        </w:tc>
+        <w:tc>
+          <w:tcPr>
+            <w:tcW w:type="dxa" w:w="4100"/>
+            <w:tcBorders>
+              <w:top w:val="single" w:color="999999" w:sz="4"/>
+              <w:left w:val="single" w:color="999999" w:sz="4"/>
+              <w:bottom w:val="single" w:color="999999" w:sz="4"/>
+              <w:right w:val="single" w:color="999999" w:sz="4"/>
+            </w:tcBorders>
+            <w:tcMar>
+              <w:top w:type="dxa" w:w="60"/>
+              <w:left w:type="dxa" w:w="100"/>
+              <w:bottom w:type="dxa" w:w="60"/>
+              <w:right w:type="dxa" w:w="100"/>
+            </w:tcMar>
+          </w:tcPr>
+          <w:p>
+            <w:pPr>
+              <w:spacing w:after="0"/>
+              <w:jc w:val="left"/>
+            </w:pPr>
+            <w:r>
+              <w:rPr>
+                <w:rFonts w:ascii="Times New Roman" w:cs="Times New Roman" w:eastAsia="Times New Roman" w:hAnsi="Times New Roman"/>
+                <w:sz w:val="21"/>
+                <w:szCs w:val="21"/>
+              </w:rPr>
+              <w:t xml:space="preserve">NLLB </w:t>
+            </w:r>
+            <w:r>
+              <w:rPr>
+                <w:rFonts w:ascii="Times New Roman" w:cs="Times New Roman" w:eastAsia="Times New Roman" w:hAnsi="Times New Roman"/>
+                <w:i/>
+                <w:iCs/>
+                <w:sz w:val="21"/>
+                <w:szCs w:val="21"/>
+              </w:rPr>
+              <w:t xml:space="preserve">mengambil sedikit strokes, atau berayun dari klub … menang</w:t>
+            </w:r>
+            <w:r>
+              <w:rPr>
+                <w:rFonts w:ascii="Times New Roman" w:cs="Times New Roman" w:eastAsia="Times New Roman" w:hAnsi="Times New Roman"/>
+                <w:sz w:val="21"/>
+                <w:szCs w:val="21"/>
+              </w:rPr>
+              <w:t xml:space="preserve">; reference </w:t>
+            </w:r>
+            <w:r>
+              <w:rPr>
+                <w:rFonts w:ascii="Times New Roman" w:cs="Times New Roman" w:eastAsia="Times New Roman" w:hAnsi="Times New Roman"/>
+                <w:i/>
+                <w:iCs/>
+                <w:sz w:val="21"/>
+                <w:szCs w:val="21"/>
+              </w:rPr>
+              <w:t xml:space="preserve">melakukan pukulan atau ayunan stik paling sedikit … Pemenangnya adalah pemain</w:t>
+            </w:r>
+            <w:r>
+              <w:rPr>
+                <w:rFonts w:ascii="Times New Roman" w:cs="Times New Roman" w:eastAsia="Times New Roman" w:hAnsi="Times New Roman"/>
+                <w:sz w:val="21"/>
+                <w:szCs w:val="21"/>
+              </w:rPr>
+              <w:t xml:space="preserve">. </w:t>
+            </w:r>
+          </w:p>
+        </w:tc>
+        <w:tc>
+          <w:tcPr>
+            <w:tcW w:type="dxa" w:w="4226"/>
+            <w:tcBorders>
+              <w:top w:val="single" w:color="999999" w:sz="4"/>
+              <w:left w:val="single" w:color="999999" w:sz="4"/>
+              <w:bottom w:val="single" w:color="999999" w:sz="4"/>
+              <w:right w:val="single" w:color="999999" w:sz="4"/>
+            </w:tcBorders>
+            <w:tcMar>
+              <w:top w:type="dxa" w:w="60"/>
+              <w:left w:type="dxa" w:w="100"/>
+              <w:bottom w:type="dxa" w:w="60"/>
+              <w:right w:type="dxa" w:w="100"/>
+            </w:tcMar>
+          </w:tcPr>
+          <w:p>
+            <w:pPr>
+              <w:spacing w:after="0"/>
+              <w:jc w:val="left"/>
+            </w:pPr>
+            <w:r>
+              <w:rPr>
+                <w:rFonts w:ascii="Times New Roman" w:cs="Times New Roman" w:eastAsia="Times New Roman" w:hAnsi="Times New Roman"/>
+                <w:sz w:val="21"/>
+                <w:szCs w:val="21"/>
+              </w:rPr>
+              <w:t xml:space="preserve">Lexical gap and polysemy: </w:t>
+            </w:r>
+            <w:r>
+              <w:rPr>
+                <w:rFonts w:ascii="Times New Roman" w:cs="Times New Roman" w:eastAsia="Times New Roman" w:hAnsi="Times New Roman"/>
+                <w:i/>
+                <w:iCs/>
+                <w:sz w:val="21"/>
+                <w:szCs w:val="21"/>
+              </w:rPr>
+              <w:t xml:space="preserve">strokes</w:t>
+            </w:r>
+            <w:r>
+              <w:rPr>
+                <w:rFonts w:ascii="Times New Roman" w:cs="Times New Roman" w:eastAsia="Times New Roman" w:hAnsi="Times New Roman"/>
+                <w:sz w:val="21"/>
+                <w:szCs w:val="21"/>
+              </w:rPr>
+              <w:t xml:space="preserve"> left in English, </w:t>
+            </w:r>
+            <w:r>
+              <w:rPr>
+                <w:rFonts w:ascii="Times New Roman" w:cs="Times New Roman" w:eastAsia="Times New Roman" w:hAnsi="Times New Roman"/>
+                <w:i/>
+                <w:iCs/>
+                <w:sz w:val="21"/>
+                <w:szCs w:val="21"/>
+              </w:rPr>
+              <w:t xml:space="preserve">club</w:t>
+            </w:r>
+            <w:r>
+              <w:rPr>
+                <w:rFonts w:ascii="Times New Roman" w:cs="Times New Roman" w:eastAsia="Times New Roman" w:hAnsi="Times New Roman"/>
+                <w:sz w:val="21"/>
+                <w:szCs w:val="21"/>
+              </w:rPr>
+              <w:t xml:space="preserve"> rendered as </w:t>
+            </w:r>
+            <w:r>
+              <w:rPr>
+                <w:rFonts w:ascii="Times New Roman" w:cs="Times New Roman" w:eastAsia="Times New Roman" w:hAnsi="Times New Roman"/>
+                <w:i/>
+                <w:iCs/>
+                <w:sz w:val="21"/>
+                <w:szCs w:val="21"/>
+              </w:rPr>
+              <w:t xml:space="preserve">klub</w:t>
+            </w:r>
+            <w:r>
+              <w:rPr>
+                <w:rFonts w:ascii="Times New Roman" w:cs="Times New Roman" w:eastAsia="Times New Roman" w:hAnsi="Times New Roman"/>
+                <w:sz w:val="21"/>
+                <w:szCs w:val="21"/>
+              </w:rPr>
+              <w:t xml:space="preserve">, which usually means an organisation, instead of </w:t>
+            </w:r>
+            <w:r>
+              <w:rPr>
+                <w:rFonts w:ascii="Times New Roman" w:cs="Times New Roman" w:eastAsia="Times New Roman" w:hAnsi="Times New Roman"/>
+                <w:i/>
+                <w:iCs/>
+                <w:sz w:val="21"/>
+                <w:szCs w:val="21"/>
+              </w:rPr>
+              <w:t xml:space="preserve">stik</w:t>
+            </w:r>
+            <w:r>
+              <w:rPr>
+                <w:rFonts w:ascii="Times New Roman" w:cs="Times New Roman" w:eastAsia="Times New Roman" w:hAnsi="Times New Roman"/>
+                <w:sz w:val="21"/>
+                <w:szCs w:val="21"/>
+              </w:rPr>
+              <w:t xml:space="preserve"> (golf club), </w:t>
+            </w:r>
+            <w:r>
+              <w:rPr>
+                <w:rFonts w:ascii="Times New Roman" w:cs="Times New Roman" w:eastAsia="Times New Roman" w:hAnsi="Times New Roman"/>
+                <w:i/>
+                <w:iCs/>
+                <w:sz w:val="21"/>
+                <w:szCs w:val="21"/>
+              </w:rPr>
+              <w:t xml:space="preserve">course</w:t>
+            </w:r>
+            <w:r>
+              <w:rPr>
+                <w:rFonts w:ascii="Times New Roman" w:cs="Times New Roman" w:eastAsia="Times New Roman" w:hAnsi="Times New Roman"/>
+                <w:sz w:val="21"/>
+                <w:szCs w:val="21"/>
+              </w:rPr>
+              <w:t xml:space="preserve"> as </w:t>
+            </w:r>
+            <w:r>
+              <w:rPr>
+                <w:rFonts w:ascii="Times New Roman" w:cs="Times New Roman" w:eastAsia="Times New Roman" w:hAnsi="Times New Roman"/>
+                <w:i/>
+                <w:iCs/>
+                <w:sz w:val="21"/>
+                <w:szCs w:val="21"/>
+              </w:rPr>
+              <w:t xml:space="preserve">kursus</w:t>
+            </w:r>
+            <w:r>
+              <w:rPr>
+                <w:rFonts w:ascii="Times New Roman" w:cs="Times New Roman" w:eastAsia="Times New Roman" w:hAnsi="Times New Roman"/>
+                <w:sz w:val="21"/>
+                <w:szCs w:val="21"/>
+              </w:rPr>
+              <w:t xml:space="preserve"> (a study course). </w:t>
+            </w:r>
+            <w:r>
+              <w:rPr>
+                <w:rFonts w:ascii="Times New Roman" w:cs="Times New Roman" w:eastAsia="Times New Roman" w:hAnsi="Times New Roman"/>
+                <w:i/>
+                <w:iCs/>
+                <w:sz w:val="21"/>
+                <w:szCs w:val="21"/>
+              </w:rPr>
+              <w:t xml:space="preserve">Fewest</w:t>
+            </w:r>
+            <w:r>
+              <w:rPr>
+                <w:rFonts w:ascii="Times New Roman" w:cs="Times New Roman" w:eastAsia="Times New Roman" w:hAnsi="Times New Roman"/>
+                <w:sz w:val="21"/>
+                <w:szCs w:val="21"/>
+              </w:rPr>
+              <w:t xml:space="preserve"> became </w:t>
+            </w:r>
+            <w:r>
+              <w:rPr>
+                <w:rFonts w:ascii="Times New Roman" w:cs="Times New Roman" w:eastAsia="Times New Roman" w:hAnsi="Times New Roman"/>
+                <w:i/>
+                <w:iCs/>
+                <w:sz w:val="21"/>
+                <w:szCs w:val="21"/>
+              </w:rPr>
+              <w:t xml:space="preserve">sedikit</w:t>
+            </w:r>
+            <w:r>
+              <w:rPr>
+                <w:rFonts w:ascii="Times New Roman" w:cs="Times New Roman" w:eastAsia="Times New Roman" w:hAnsi="Times New Roman"/>
+                <w:sz w:val="21"/>
+                <w:szCs w:val="21"/>
+              </w:rPr>
+              <w:t xml:space="preserve"> (“a few”), losing the superlative.</w:t>
+            </w:r>
+          </w:p>
+        </w:tc>
+      </w:tr>
+      <w:tr>
+        <w:tc>
+          <w:tcPr>
+            <w:tcW w:type="dxa" w:w="700"/>
+            <w:tcBorders>
+              <w:top w:val="single" w:color="999999" w:sz="4"/>
+              <w:left w:val="single" w:color="999999" w:sz="4"/>
+              <w:bottom w:val="single" w:color="999999" w:sz="4"/>
+              <w:right w:val="single" w:color="999999" w:sz="4"/>
+            </w:tcBorders>
+            <w:tcMar>
+              <w:top w:type="dxa" w:w="60"/>
+              <w:left w:type="dxa" w:w="100"/>
+              <w:bottom w:type="dxa" w:w="60"/>
+              <w:right w:type="dxa" w:w="100"/>
+            </w:tcMar>
+          </w:tcPr>
+          <w:p>
+            <w:pPr>
+              <w:spacing w:after="0"/>
+              <w:jc w:val="left"/>
+            </w:pPr>
+            <w:r>
+              <w:rPr>
+                <w:rFonts w:ascii="Times New Roman" w:cs="Times New Roman" w:eastAsia="Times New Roman" w:hAnsi="Times New Roman"/>
+                <w:sz w:val="21"/>
+                <w:szCs w:val="21"/>
+              </w:rPr>
+              <w:t xml:space="preserve">1340</w:t>
+            </w:r>
+          </w:p>
+        </w:tc>
+        <w:tc>
+          <w:tcPr>
+            <w:tcW w:type="dxa" w:w="4100"/>
+            <w:tcBorders>
+              <w:top w:val="single" w:color="999999" w:sz="4"/>
+              <w:left w:val="single" w:color="999999" w:sz="4"/>
+              <w:bottom w:val="single" w:color="999999" w:sz="4"/>
+              <w:right w:val="single" w:color="999999" w:sz="4"/>
+            </w:tcBorders>
+            <w:tcMar>
+              <w:top w:type="dxa" w:w="60"/>
+              <w:left w:type="dxa" w:w="100"/>
+              <w:bottom w:type="dxa" w:w="60"/>
+              <w:right w:type="dxa" w:w="100"/>
+            </w:tcMar>
+          </w:tcPr>
+          <w:p>
+            <w:pPr>
+              <w:spacing w:after="0"/>
+              <w:jc w:val="left"/>
+            </w:pPr>
+            <w:r>
+              <w:rPr>
+                <w:rFonts w:ascii="Times New Roman" w:cs="Times New Roman" w:eastAsia="Times New Roman" w:hAnsi="Times New Roman"/>
+                <w:sz w:val="21"/>
+                <w:szCs w:val="21"/>
+              </w:rPr>
+              <w:t xml:space="preserve">Source: </w:t>
+            </w:r>
+            <w:r>
+              <w:rPr>
+                <w:rFonts w:ascii="Times New Roman" w:cs="Times New Roman" w:eastAsia="Times New Roman" w:hAnsi="Times New Roman"/>
+                <w:i/>
+                <w:iCs/>
+                <w:sz w:val="21"/>
+                <w:szCs w:val="21"/>
+              </w:rPr>
+              <w:t xml:space="preserve">It can be pulled into thin wire, which can be twisted and plaited. It can be hammered or rolled into sheets.</w:t>
+            </w:r>
+            <w:r>
+              <w:rPr>
+                <w:rFonts w:ascii="Times New Roman" w:cs="Times New Roman" w:eastAsia="Times New Roman" w:hAnsi="Times New Roman"/>
+                <w:sz w:val="21"/>
+                <w:szCs w:val="21"/>
+              </w:rPr>
+              <w:t xml:space="preserve"> NLLB translates only the first sentence and renders </w:t>
+            </w:r>
+            <w:r>
+              <w:rPr>
+                <w:rFonts w:ascii="Times New Roman" w:cs="Times New Roman" w:eastAsia="Times New Roman" w:hAnsi="Times New Roman"/>
+                <w:i/>
+                <w:iCs/>
+                <w:sz w:val="21"/>
+                <w:szCs w:val="21"/>
+              </w:rPr>
+              <w:t xml:space="preserve">plaited</w:t>
+            </w:r>
+            <w:r>
+              <w:rPr>
+                <w:rFonts w:ascii="Times New Roman" w:cs="Times New Roman" w:eastAsia="Times New Roman" w:hAnsi="Times New Roman"/>
+                <w:sz w:val="21"/>
+                <w:szCs w:val="21"/>
+              </w:rPr>
+              <w:t xml:space="preserve"> as </w:t>
+            </w:r>
+            <w:r>
+              <w:rPr>
+                <w:rFonts w:ascii="Times New Roman" w:cs="Times New Roman" w:eastAsia="Times New Roman" w:hAnsi="Times New Roman"/>
+                <w:i/>
+                <w:iCs/>
+                <w:sz w:val="21"/>
+                <w:szCs w:val="21"/>
+              </w:rPr>
+              <w:t xml:space="preserve">dilapisi</w:t>
+            </w:r>
+            <w:r>
+              <w:rPr>
+                <w:rFonts w:ascii="Times New Roman" w:cs="Times New Roman" w:eastAsia="Times New Roman" w:hAnsi="Times New Roman"/>
+                <w:sz w:val="21"/>
+                <w:szCs w:val="21"/>
+              </w:rPr>
+              <w:t xml:space="preserve"> (“coated”). The reference supplies the subject </w:t>
+            </w:r>
+            <w:r>
+              <w:rPr>
+                <w:rFonts w:ascii="Times New Roman" w:cs="Times New Roman" w:eastAsia="Times New Roman" w:hAnsi="Times New Roman"/>
+                <w:i/>
+                <w:iCs/>
+                <w:sz w:val="21"/>
+                <w:szCs w:val="21"/>
+              </w:rPr>
+              <w:t xml:space="preserve">Emas</w:t>
+            </w:r>
+            <w:r>
+              <w:rPr>
+                <w:rFonts w:ascii="Times New Roman" w:cs="Times New Roman" w:eastAsia="Times New Roman" w:hAnsi="Times New Roman"/>
+                <w:sz w:val="21"/>
+                <w:szCs w:val="21"/>
+              </w:rPr>
+              <w:t xml:space="preserve"> (gold) from the previous sentence.</w:t>
+            </w:r>
+          </w:p>
+        </w:tc>
+        <w:tc>
+          <w:tcPr>
+            <w:tcW w:type="dxa" w:w="4226"/>
+            <w:tcBorders>
+              <w:top w:val="single" w:color="999999" w:sz="4"/>
+              <w:left w:val="single" w:color="999999" w:sz="4"/>
+              <w:bottom w:val="single" w:color="999999" w:sz="4"/>
+              <w:right w:val="single" w:color="999999" w:sz="4"/>
+            </w:tcBorders>
+            <w:tcMar>
+              <w:top w:type="dxa" w:w="60"/>
+              <w:left w:type="dxa" w:w="100"/>
+              <w:bottom w:type="dxa" w:w="60"/>
+              <w:right w:type="dxa" w:w="100"/>
+            </w:tcMar>
+          </w:tcPr>
+          <w:p>
+            <w:pPr>
+              <w:spacing w:after="0"/>
+              <w:jc w:val="left"/>
+            </w:pPr>
+            <w:r>
+              <w:rPr>
+                <w:rFonts w:ascii="Times New Roman" w:cs="Times New Roman" w:eastAsia="Times New Roman" w:hAnsi="Times New Roman"/>
+                <w:sz w:val="21"/>
+                <w:szCs w:val="21"/>
+              </w:rPr>
+              <w:t xml:space="preserve">Omission of the second sentence; wrong word sense (</w:t>
+            </w:r>
+            <w:r>
+              <w:rPr>
+                <w:rFonts w:ascii="Times New Roman" w:cs="Times New Roman" w:eastAsia="Times New Roman" w:hAnsi="Times New Roman"/>
+                <w:i/>
+                <w:iCs/>
+                <w:sz w:val="21"/>
+                <w:szCs w:val="21"/>
+              </w:rPr>
+              <w:t xml:space="preserve">plait</w:t>
+            </w:r>
+            <w:r>
+              <w:rPr>
+                <w:rFonts w:ascii="Times New Roman" w:cs="Times New Roman" w:eastAsia="Times New Roman" w:hAnsi="Times New Roman"/>
+                <w:sz w:val="21"/>
+                <w:szCs w:val="21"/>
+              </w:rPr>
+              <w:t xml:space="preserve"> vs </w:t>
+            </w:r>
+            <w:r>
+              <w:rPr>
+                <w:rFonts w:ascii="Times New Roman" w:cs="Times New Roman" w:eastAsia="Times New Roman" w:hAnsi="Times New Roman"/>
+                <w:i/>
+                <w:iCs/>
+                <w:sz w:val="21"/>
+                <w:szCs w:val="21"/>
+              </w:rPr>
+              <w:t xml:space="preserve">coat</w:t>
+            </w:r>
+            <w:r>
+              <w:rPr>
+                <w:rFonts w:ascii="Times New Roman" w:cs="Times New Roman" w:eastAsia="Times New Roman" w:hAnsi="Times New Roman"/>
+                <w:sz w:val="21"/>
+                <w:szCs w:val="21"/>
+              </w:rPr>
+              <w:t xml:space="preserve">); reference adds context that the source does not contain.</w:t>
+            </w:r>
+          </w:p>
+        </w:tc>
+      </w:tr>
+      <w:tr>
+        <w:tc>
+          <w:tcPr>
+            <w:tcW w:type="dxa" w:w="700"/>
+            <w:tcBorders>
+              <w:top w:val="single" w:color="999999" w:sz="4"/>
+              <w:left w:val="single" w:color="999999" w:sz="4"/>
+              <w:bottom w:val="single" w:color="999999" w:sz="4"/>
+              <w:right w:val="single" w:color="999999" w:sz="4"/>
+            </w:tcBorders>
+            <w:tcMar>
+              <w:top w:type="dxa" w:w="60"/>
+              <w:left w:type="dxa" w:w="100"/>
+              <w:bottom w:type="dxa" w:w="60"/>
+              <w:right w:type="dxa" w:w="100"/>
+            </w:tcMar>
+          </w:tcPr>
+          <w:p>
+            <w:pPr>
+              <w:spacing w:after="0"/>
+              <w:jc w:val="left"/>
+            </w:pPr>
+            <w:r>
+              <w:rPr>
+                <w:rFonts w:ascii="Times New Roman" w:cs="Times New Roman" w:eastAsia="Times New Roman" w:hAnsi="Times New Roman"/>
+                <w:sz w:val="21"/>
+                <w:szCs w:val="21"/>
+              </w:rPr>
+              <w:t xml:space="preserve">1199</w:t>
+            </w:r>
+          </w:p>
+        </w:tc>
+        <w:tc>
+          <w:tcPr>
+            <w:tcW w:type="dxa" w:w="4100"/>
+            <w:tcBorders>
+              <w:top w:val="single" w:color="999999" w:sz="4"/>
+              <w:left w:val="single" w:color="999999" w:sz="4"/>
+              <w:bottom w:val="single" w:color="999999" w:sz="4"/>
+              <w:right w:val="single" w:color="999999" w:sz="4"/>
+            </w:tcBorders>
+            <w:tcMar>
+              <w:top w:type="dxa" w:w="60"/>
+              <w:left w:type="dxa" w:w="100"/>
+              <w:bottom w:type="dxa" w:w="60"/>
+              <w:right w:type="dxa" w:w="100"/>
+            </w:tcMar>
+          </w:tcPr>
+          <w:p>
+            <w:pPr>
+              <w:spacing w:after="0"/>
+              <w:jc w:val="left"/>
+            </w:pPr>
+            <w:r>
+              <w:rPr>
+                <w:rFonts w:ascii="Times New Roman" w:cs="Times New Roman" w:eastAsia="Times New Roman" w:hAnsi="Times New Roman"/>
+                <w:sz w:val="21"/>
+                <w:szCs w:val="21"/>
+              </w:rPr>
+              <w:t xml:space="preserve">NLLB leaves </w:t>
+            </w:r>
+            <w:r>
+              <w:rPr>
+                <w:rFonts w:ascii="Times New Roman" w:cs="Times New Roman" w:eastAsia="Times New Roman" w:hAnsi="Times New Roman"/>
+                <w:i/>
+                <w:iCs/>
+                <w:sz w:val="21"/>
+                <w:szCs w:val="21"/>
+              </w:rPr>
+              <w:t xml:space="preserve">men standing Super-G</w:t>
+            </w:r>
+            <w:r>
+              <w:rPr>
+                <w:rFonts w:ascii="Times New Roman" w:cs="Times New Roman" w:eastAsia="Times New Roman" w:hAnsi="Times New Roman"/>
+                <w:sz w:val="21"/>
+                <w:szCs w:val="21"/>
+              </w:rPr>
+              <w:t xml:space="preserve"> and </w:t>
+            </w:r>
+            <w:r>
+              <w:rPr>
+                <w:rFonts w:ascii="Times New Roman" w:cs="Times New Roman" w:eastAsia="Times New Roman" w:hAnsi="Times New Roman"/>
+                <w:i/>
+                <w:iCs/>
+                <w:sz w:val="21"/>
+                <w:szCs w:val="21"/>
+              </w:rPr>
+              <w:t xml:space="preserve">men sitting Super-G</w:t>
+            </w:r>
+            <w:r>
+              <w:rPr>
+                <w:rFonts w:ascii="Times New Roman" w:cs="Times New Roman" w:eastAsia="Times New Roman" w:hAnsi="Times New Roman"/>
+                <w:sz w:val="21"/>
+                <w:szCs w:val="21"/>
+              </w:rPr>
+              <w:t xml:space="preserve"> untranslated and writes </w:t>
+            </w:r>
+            <w:r>
+              <w:rPr>
+                <w:rFonts w:ascii="Times New Roman" w:cs="Times New Roman" w:eastAsia="Times New Roman" w:hAnsi="Times New Roman"/>
+                <w:i/>
+                <w:iCs/>
+                <w:sz w:val="21"/>
+                <w:szCs w:val="21"/>
+              </w:rPr>
+              <w:t xml:space="preserve">Czech</w:t>
+            </w:r>
+            <w:r>
+              <w:rPr>
+                <w:rFonts w:ascii="Times New Roman" w:cs="Times New Roman" w:eastAsia="Times New Roman" w:hAnsi="Times New Roman"/>
+                <w:sz w:val="21"/>
+                <w:szCs w:val="21"/>
+              </w:rPr>
+              <w:t xml:space="preserve"> instead of </w:t>
+            </w:r>
+            <w:r>
+              <w:rPr>
+                <w:rFonts w:ascii="Times New Roman" w:cs="Times New Roman" w:eastAsia="Times New Roman" w:hAnsi="Times New Roman"/>
+                <w:i/>
+                <w:iCs/>
+                <w:sz w:val="21"/>
+                <w:szCs w:val="21"/>
+              </w:rPr>
+              <w:t xml:space="preserve">Ceko</w:t>
+            </w:r>
+            <w:r>
+              <w:rPr>
+                <w:rFonts w:ascii="Times New Roman" w:cs="Times New Roman" w:eastAsia="Times New Roman" w:hAnsi="Times New Roman"/>
+                <w:sz w:val="21"/>
+                <w:szCs w:val="21"/>
+              </w:rPr>
+              <w:t xml:space="preserve">; reference </w:t>
+            </w:r>
+            <w:r>
+              <w:rPr>
+                <w:rFonts w:ascii="Times New Roman" w:cs="Times New Roman" w:eastAsia="Times New Roman" w:hAnsi="Times New Roman"/>
+                <w:i/>
+                <w:iCs/>
+                <w:sz w:val="21"/>
+                <w:szCs w:val="21"/>
+              </w:rPr>
+              <w:t xml:space="preserve">Super-G berdiri pria</w:t>
+            </w:r>
+            <w:r>
+              <w:rPr>
+                <w:rFonts w:ascii="Times New Roman" w:cs="Times New Roman" w:eastAsia="Times New Roman" w:hAnsi="Times New Roman"/>
+                <w:sz w:val="21"/>
+                <w:szCs w:val="21"/>
+              </w:rPr>
+              <w:t xml:space="preserve">.</w:t>
+            </w:r>
+          </w:p>
+        </w:tc>
+        <w:tc>
+          <w:tcPr>
+            <w:tcW w:type="dxa" w:w="4226"/>
+            <w:tcBorders>
+              <w:top w:val="single" w:color="999999" w:sz="4"/>
+              <w:left w:val="single" w:color="999999" w:sz="4"/>
+              <w:bottom w:val="single" w:color="999999" w:sz="4"/>
+              <w:right w:val="single" w:color="999999" w:sz="4"/>
+            </w:tcBorders>
+            <w:tcMar>
+              <w:top w:type="dxa" w:w="60"/>
+              <w:left w:type="dxa" w:w="100"/>
+              <w:bottom w:type="dxa" w:w="60"/>
+              <w:right w:type="dxa" w:w="100"/>
+            </w:tcMar>
+          </w:tcPr>
+          <w:p>
+            <w:pPr>
+              <w:spacing w:after="0"/>
+              <w:jc w:val="left"/>
+            </w:pPr>
+            <w:r>
+              <w:rPr>
+                <w:rFonts w:ascii="Times New Roman" w:cs="Times New Roman" w:eastAsia="Times New Roman" w:hAnsi="Times New Roman"/>
+                <w:sz w:val="21"/>
+                <w:szCs w:val="21"/>
+              </w:rPr>
+              <w:t xml:space="preserve">Untranslated English (code-switching) in a term made of modifiers; word order again: English </w:t>
+            </w:r>
+            <w:r>
+              <w:rPr>
+                <w:rFonts w:ascii="Times New Roman" w:cs="Times New Roman" w:eastAsia="Times New Roman" w:hAnsi="Times New Roman"/>
+                <w:i/>
+                <w:iCs/>
+                <w:sz w:val="21"/>
+                <w:szCs w:val="21"/>
+              </w:rPr>
+              <w:t xml:space="preserve">men’s standing Super-G</w:t>
+            </w:r>
+            <w:r>
+              <w:rPr>
+                <w:rFonts w:ascii="Times New Roman" w:cs="Times New Roman" w:eastAsia="Times New Roman" w:hAnsi="Times New Roman"/>
+                <w:sz w:val="21"/>
+                <w:szCs w:val="21"/>
+              </w:rPr>
+              <w:t xml:space="preserve"> needs the head first, </w:t>
+            </w:r>
+            <w:r>
+              <w:rPr>
+                <w:rFonts w:ascii="Times New Roman" w:cs="Times New Roman" w:eastAsia="Times New Roman" w:hAnsi="Times New Roman"/>
+                <w:i/>
+                <w:iCs/>
+                <w:sz w:val="21"/>
+                <w:szCs w:val="21"/>
+              </w:rPr>
+              <w:t xml:space="preserve">Super-G berdiri pria</w:t>
+            </w:r>
+            <w:r>
+              <w:rPr>
+                <w:rFonts w:ascii="Times New Roman" w:cs="Times New Roman" w:eastAsia="Times New Roman" w:hAnsi="Times New Roman"/>
+                <w:sz w:val="21"/>
+                <w:szCs w:val="21"/>
+              </w:rPr>
+              <w:t xml:space="preserve">. </w:t>
+            </w:r>
+            <w:r>
+              <w:rPr>
+                <w:rFonts w:ascii="Times New Roman" w:cs="Times New Roman" w:eastAsia="Times New Roman" w:hAnsi="Times New Roman"/>
+                <w:i/>
+                <w:iCs/>
+                <w:sz w:val="21"/>
+                <w:szCs w:val="21"/>
+              </w:rPr>
+              <w:t xml:space="preserve">Pemain Australia</w:t>
+            </w:r>
+            <w:r>
+              <w:rPr>
+                <w:rFonts w:ascii="Times New Roman" w:cs="Times New Roman" w:eastAsia="Times New Roman" w:hAnsi="Times New Roman"/>
+                <w:sz w:val="21"/>
+                <w:szCs w:val="21"/>
+              </w:rPr>
+              <w:t xml:space="preserve"> for </w:t>
+            </w:r>
+            <w:r>
+              <w:rPr>
+                <w:rFonts w:ascii="Times New Roman" w:cs="Times New Roman" w:eastAsia="Times New Roman" w:hAnsi="Times New Roman"/>
+                <w:i/>
+                <w:iCs/>
+                <w:sz w:val="21"/>
+                <w:szCs w:val="21"/>
+              </w:rPr>
+              <w:t xml:space="preserve">Australia’s</w:t>
+            </w:r>
+            <w:r>
+              <w:rPr>
+                <w:rFonts w:ascii="Times New Roman" w:cs="Times New Roman" w:eastAsia="Times New Roman" w:hAnsi="Times New Roman"/>
+                <w:sz w:val="21"/>
+                <w:szCs w:val="21"/>
+              </w:rPr>
+              <w:t xml:space="preserve"> also adds a word that is not in the source.</w:t>
+            </w:r>
+          </w:p>
+        </w:tc>
+      </w:tr>
+      <w:tr>
+        <w:tc>
+          <w:tcPr>
+            <w:tcW w:type="dxa" w:w="700"/>
+            <w:tcBorders>
+              <w:top w:val="single" w:color="999999" w:sz="4"/>
+              <w:left w:val="single" w:color="999999" w:sz="4"/>
+              <w:bottom w:val="single" w:color="999999" w:sz="4"/>
+              <w:right w:val="single" w:color="999999" w:sz="4"/>
+            </w:tcBorders>
+            <w:tcMar>
+              <w:top w:type="dxa" w:w="60"/>
+              <w:left w:type="dxa" w:w="100"/>
+              <w:bottom w:type="dxa" w:w="60"/>
+              <w:right w:type="dxa" w:w="100"/>
+            </w:tcMar>
+          </w:tcPr>
+          <w:p>
+            <w:pPr>
+              <w:spacing w:after="0"/>
+              <w:jc w:val="left"/>
+            </w:pPr>
+            <w:r>
+              <w:rPr>
+                <w:rFonts w:ascii="Times New Roman" w:cs="Times New Roman" w:eastAsia="Times New Roman" w:hAnsi="Times New Roman"/>
+                <w:sz w:val="21"/>
+                <w:szCs w:val="21"/>
+              </w:rPr>
+              <w:t xml:space="preserve">1570</w:t>
+            </w:r>
+          </w:p>
+        </w:tc>
+        <w:tc>
+          <w:tcPr>
+            <w:tcW w:type="dxa" w:w="4100"/>
+            <w:tcBorders>
+              <w:top w:val="single" w:color="999999" w:sz="4"/>
+              <w:left w:val="single" w:color="999999" w:sz="4"/>
+              <w:bottom w:val="single" w:color="999999" w:sz="4"/>
+              <w:right w:val="single" w:color="999999" w:sz="4"/>
+            </w:tcBorders>
+            <w:tcMar>
+              <w:top w:type="dxa" w:w="60"/>
+              <w:left w:type="dxa" w:w="100"/>
+              <w:bottom w:type="dxa" w:w="60"/>
+              <w:right w:type="dxa" w:w="100"/>
+            </w:tcMar>
+          </w:tcPr>
+          <w:p>
+            <w:pPr>
+              <w:spacing w:after="0"/>
+              <w:jc w:val="left"/>
+            </w:pPr>
+            <w:r>
+              <w:rPr>
+                <w:rFonts w:ascii="Times New Roman" w:cs="Times New Roman" w:eastAsia="Times New Roman" w:hAnsi="Times New Roman"/>
+                <w:sz w:val="21"/>
+                <w:szCs w:val="21"/>
+              </w:rPr>
+              <w:t xml:space="preserve">NLLB translates the first sentence only. It also writes </w:t>
+            </w:r>
+            <w:r>
+              <w:rPr>
+                <w:rFonts w:ascii="Times New Roman" w:cs="Times New Roman" w:eastAsia="Times New Roman" w:hAnsi="Times New Roman"/>
+                <w:i/>
+                <w:iCs/>
+                <w:sz w:val="21"/>
+                <w:szCs w:val="21"/>
+              </w:rPr>
+              <w:t xml:space="preserve">25 sisi lebar Dunlap</w:t>
+            </w:r>
+            <w:r>
+              <w:rPr>
+                <w:rFonts w:ascii="Times New Roman" w:cs="Times New Roman" w:eastAsia="Times New Roman" w:hAnsi="Times New Roman"/>
+                <w:sz w:val="21"/>
+                <w:szCs w:val="21"/>
+              </w:rPr>
+              <w:t xml:space="preserve"> for </w:t>
+            </w:r>
+            <w:r>
+              <w:rPr>
+                <w:rFonts w:ascii="Times New Roman" w:cs="Times New Roman" w:eastAsia="Times New Roman" w:hAnsi="Times New Roman"/>
+                <w:i/>
+                <w:iCs/>
+                <w:sz w:val="21"/>
+                <w:szCs w:val="21"/>
+              </w:rPr>
+              <w:t xml:space="preserve">the 25 Dunlap broadsides</w:t>
+            </w:r>
+            <w:r>
+              <w:rPr>
+                <w:rFonts w:ascii="Times New Roman" w:cs="Times New Roman" w:eastAsia="Times New Roman" w:hAnsi="Times New Roman"/>
+                <w:sz w:val="21"/>
+                <w:szCs w:val="21"/>
+              </w:rPr>
+              <w:t xml:space="preserve"> (a literal reading of </w:t>
+            </w:r>
+            <w:r>
+              <w:rPr>
+                <w:rFonts w:ascii="Times New Roman" w:cs="Times New Roman" w:eastAsia="Times New Roman" w:hAnsi="Times New Roman"/>
+                <w:i/>
+                <w:iCs/>
+                <w:sz w:val="21"/>
+                <w:szCs w:val="21"/>
+              </w:rPr>
+              <w:t xml:space="preserve">broadside</w:t>
+            </w:r>
+            <w:r>
+              <w:rPr>
+                <w:rFonts w:ascii="Times New Roman" w:cs="Times New Roman" w:eastAsia="Times New Roman" w:hAnsi="Times New Roman"/>
+                <w:sz w:val="21"/>
+                <w:szCs w:val="21"/>
+              </w:rPr>
+              <w:t xml:space="preserve"> as “wide side”); the reference has </w:t>
+            </w:r>
+            <w:r>
+              <w:rPr>
+                <w:rFonts w:ascii="Times New Roman" w:cs="Times New Roman" w:eastAsia="Times New Roman" w:hAnsi="Times New Roman"/>
+                <w:i/>
+                <w:iCs/>
+                <w:sz w:val="21"/>
+                <w:szCs w:val="21"/>
+              </w:rPr>
+              <w:t xml:space="preserve">selebaran</w:t>
+            </w:r>
+            <w:r>
+              <w:rPr>
+                <w:rFonts w:ascii="Times New Roman" w:cs="Times New Roman" w:eastAsia="Times New Roman" w:hAnsi="Times New Roman"/>
+                <w:sz w:val="21"/>
+                <w:szCs w:val="21"/>
+              </w:rPr>
+              <w:t xml:space="preserve">.</w:t>
+            </w:r>
+          </w:p>
+        </w:tc>
+        <w:tc>
+          <w:tcPr>
+            <w:tcW w:type="dxa" w:w="4226"/>
+            <w:tcBorders>
+              <w:top w:val="single" w:color="999999" w:sz="4"/>
+              <w:left w:val="single" w:color="999999" w:sz="4"/>
+              <w:bottom w:val="single" w:color="999999" w:sz="4"/>
+              <w:right w:val="single" w:color="999999" w:sz="4"/>
+            </w:tcBorders>
+            <w:tcMar>
+              <w:top w:type="dxa" w:w="60"/>
+              <w:left w:type="dxa" w:w="100"/>
+              <w:bottom w:type="dxa" w:w="60"/>
+              <w:right w:type="dxa" w:w="100"/>
+            </w:tcMar>
+          </w:tcPr>
+          <w:p>
+            <w:pPr>
+              <w:spacing w:after="0"/>
+              <w:jc w:val="left"/>
+            </w:pPr>
+            <w:r>
+              <w:rPr>
+                <w:rFonts w:ascii="Times New Roman" w:cs="Times New Roman" w:eastAsia="Times New Roman" w:hAnsi="Times New Roman"/>
+                <w:sz w:val="21"/>
+                <w:szCs w:val="21"/>
+              </w:rPr>
+              <w:t xml:space="preserve">Omission; polysemy / lexical gap (</w:t>
+            </w:r>
+            <w:r>
+              <w:rPr>
+                <w:rFonts w:ascii="Times New Roman" w:cs="Times New Roman" w:eastAsia="Times New Roman" w:hAnsi="Times New Roman"/>
+                <w:i/>
+                <w:iCs/>
+                <w:sz w:val="21"/>
+                <w:szCs w:val="21"/>
+              </w:rPr>
+              <w:t xml:space="preserve">broadside</w:t>
+            </w:r>
+            <w:r>
+              <w:rPr>
+                <w:rFonts w:ascii="Times New Roman" w:cs="Times New Roman" w:eastAsia="Times New Roman" w:hAnsi="Times New Roman"/>
+                <w:sz w:val="21"/>
+                <w:szCs w:val="21"/>
+              </w:rPr>
+              <w:t xml:space="preserve"> as a printed sheet).</w:t>
+            </w:r>
+          </w:p>
+        </w:tc>
+      </w:tr>
+      <w:tr>
+        <w:tc>
+          <w:tcPr>
+            <w:tcW w:type="dxa" w:w="700"/>
+            <w:tcBorders>
+              <w:top w:val="single" w:color="999999" w:sz="4"/>
+              <w:left w:val="single" w:color="999999" w:sz="4"/>
+              <w:bottom w:val="single" w:color="999999" w:sz="4"/>
+              <w:right w:val="single" w:color="999999" w:sz="4"/>
+            </w:tcBorders>
+            <w:tcMar>
+              <w:top w:type="dxa" w:w="60"/>
+              <w:left w:type="dxa" w:w="100"/>
+              <w:bottom w:type="dxa" w:w="60"/>
+              <w:right w:type="dxa" w:w="100"/>
+            </w:tcMar>
+          </w:tcPr>
+          <w:p>
+            <w:pPr>
+              <w:spacing w:after="0"/>
+              <w:jc w:val="left"/>
+            </w:pPr>
+            <w:r>
+              <w:rPr>
+                <w:rFonts w:ascii="Times New Roman" w:cs="Times New Roman" w:eastAsia="Times New Roman" w:hAnsi="Times New Roman"/>
+                <w:sz w:val="21"/>
+                <w:szCs w:val="21"/>
+              </w:rPr>
+              <w:t xml:space="preserve">1152</w:t>
+            </w:r>
+          </w:p>
+        </w:tc>
+        <w:tc>
+          <w:tcPr>
+            <w:tcW w:type="dxa" w:w="4100"/>
+            <w:tcBorders>
+              <w:top w:val="single" w:color="999999" w:sz="4"/>
+              <w:left w:val="single" w:color="999999" w:sz="4"/>
+              <w:bottom w:val="single" w:color="999999" w:sz="4"/>
+              <w:right w:val="single" w:color="999999" w:sz="4"/>
+            </w:tcBorders>
+            <w:tcMar>
+              <w:top w:type="dxa" w:w="60"/>
+              <w:left w:type="dxa" w:w="100"/>
+              <w:bottom w:type="dxa" w:w="60"/>
+              <w:right w:type="dxa" w:w="100"/>
+            </w:tcMar>
+          </w:tcPr>
+          <w:p>
+            <w:pPr>
+              <w:spacing w:after="0"/>
+              <w:jc w:val="left"/>
+            </w:pPr>
+            <w:r>
+              <w:rPr>
+                <w:rFonts w:ascii="Times New Roman" w:cs="Times New Roman" w:eastAsia="Times New Roman" w:hAnsi="Times New Roman"/>
+                <w:sz w:val="21"/>
+                <w:szCs w:val="21"/>
+              </w:rPr>
+              <w:t xml:space="preserve">Source: </w:t>
+            </w:r>
+            <w:r>
+              <w:rPr>
+                <w:rFonts w:ascii="Times New Roman" w:cs="Times New Roman" w:eastAsia="Times New Roman" w:hAnsi="Times New Roman"/>
+                <w:i/>
+                <w:iCs/>
+                <w:sz w:val="21"/>
+                <w:szCs w:val="21"/>
+              </w:rPr>
+              <w:t xml:space="preserve">Looking decidedly rusty … South Africa however steadily improved.</w:t>
+            </w:r>
+            <w:r>
+              <w:rPr>
+                <w:rFonts w:ascii="Times New Roman" w:cs="Times New Roman" w:eastAsia="Times New Roman" w:hAnsi="Times New Roman"/>
+                <w:sz w:val="21"/>
+                <w:szCs w:val="21"/>
+              </w:rPr>
+              <w:t xml:space="preserve"> NLLB: </w:t>
+            </w:r>
+            <w:r>
+              <w:rPr>
+                <w:rFonts w:ascii="Times New Roman" w:cs="Times New Roman" w:eastAsia="Times New Roman" w:hAnsi="Times New Roman"/>
+                <w:i/>
+                <w:iCs/>
+                <w:sz w:val="21"/>
+                <w:szCs w:val="21"/>
+              </w:rPr>
+              <w:t xml:space="preserve">Afrika Selatan terlihat sangat berkarat</w:t>
+            </w:r>
+            <w:r>
+              <w:rPr>
+                <w:rFonts w:ascii="Times New Roman" w:cs="Times New Roman" w:eastAsia="Times New Roman" w:hAnsi="Times New Roman"/>
+                <w:sz w:val="21"/>
+                <w:szCs w:val="21"/>
+              </w:rPr>
+              <w:t xml:space="preserve"> (“looked very covered in rust”); reference </w:t>
+            </w:r>
+            <w:r>
+              <w:rPr>
+                <w:rFonts w:ascii="Times New Roman" w:cs="Times New Roman" w:eastAsia="Times New Roman" w:hAnsi="Times New Roman"/>
+                <w:i/>
+                <w:iCs/>
+                <w:sz w:val="21"/>
+                <w:szCs w:val="21"/>
+              </w:rPr>
+              <w:t xml:space="preserve">kurang latihan</w:t>
+            </w:r>
+            <w:r>
+              <w:rPr>
+                <w:rFonts w:ascii="Times New Roman" w:cs="Times New Roman" w:eastAsia="Times New Roman" w:hAnsi="Times New Roman"/>
+                <w:sz w:val="21"/>
+                <w:szCs w:val="21"/>
+              </w:rPr>
+              <w:t xml:space="preserve"> (“out of practice”).</w:t>
+            </w:r>
+          </w:p>
+        </w:tc>
+        <w:tc>
+          <w:tcPr>
+            <w:tcW w:type="dxa" w:w="4226"/>
+            <w:tcBorders>
+              <w:top w:val="single" w:color="999999" w:sz="4"/>
+              <w:left w:val="single" w:color="999999" w:sz="4"/>
+              <w:bottom w:val="single" w:color="999999" w:sz="4"/>
+              <w:right w:val="single" w:color="999999" w:sz="4"/>
+            </w:tcBorders>
+            <w:tcMar>
+              <w:top w:type="dxa" w:w="60"/>
+              <w:left w:type="dxa" w:w="100"/>
+              <w:bottom w:type="dxa" w:w="60"/>
+              <w:right w:type="dxa" w:w="100"/>
+            </w:tcMar>
+          </w:tcPr>
+          <w:p>
+            <w:pPr>
+              <w:spacing w:after="0"/>
+              <w:jc w:val="left"/>
+            </w:pPr>
+            <w:r>
+              <w:rPr>
+                <w:rFonts w:ascii="Times New Roman" w:cs="Times New Roman" w:eastAsia="Times New Roman" w:hAnsi="Times New Roman"/>
+                <w:sz w:val="21"/>
+                <w:szCs w:val="21"/>
+              </w:rPr>
+              <w:t xml:space="preserve">Idiom translated literally (</w:t>
+            </w:r>
+            <w:r>
+              <w:rPr>
+                <w:rFonts w:ascii="Times New Roman" w:cs="Times New Roman" w:eastAsia="Times New Roman" w:hAnsi="Times New Roman"/>
+                <w:i/>
+                <w:iCs/>
+                <w:sz w:val="21"/>
+                <w:szCs w:val="21"/>
+              </w:rPr>
+              <w:t xml:space="preserve">rusty</w:t>
+            </w:r>
+            <w:r>
+              <w:rPr>
+                <w:rFonts w:ascii="Times New Roman" w:cs="Times New Roman" w:eastAsia="Times New Roman" w:hAnsi="Times New Roman"/>
+                <w:sz w:val="21"/>
+                <w:szCs w:val="21"/>
+              </w:rPr>
+              <w:t xml:space="preserve">). </w:t>
+            </w:r>
+            <w:r>
+              <w:rPr>
+                <w:rFonts w:ascii="Times New Roman" w:cs="Times New Roman" w:eastAsia="Times New Roman" w:hAnsi="Times New Roman"/>
+                <w:i/>
+                <w:iCs/>
+                <w:sz w:val="21"/>
+                <w:szCs w:val="21"/>
+              </w:rPr>
+              <w:t xml:space="preserve">Saudara-saudaranya di selatan</w:t>
+            </w:r>
+            <w:r>
+              <w:rPr>
+                <w:rFonts w:ascii="Times New Roman" w:cs="Times New Roman" w:eastAsia="Times New Roman" w:hAnsi="Times New Roman"/>
+                <w:sz w:val="21"/>
+                <w:szCs w:val="21"/>
+              </w:rPr>
+              <w:t xml:space="preserve"> (“their brothers in the south”) for </w:t>
+            </w:r>
+            <w:r>
+              <w:rPr>
+                <w:rFonts w:ascii="Times New Roman" w:cs="Times New Roman" w:eastAsia="Times New Roman" w:hAnsi="Times New Roman"/>
+                <w:i/>
+                <w:iCs/>
+                <w:sz w:val="21"/>
+                <w:szCs w:val="21"/>
+              </w:rPr>
+              <w:t xml:space="preserve">southern sisters</w:t>
+            </w:r>
+            <w:r>
+              <w:rPr>
+                <w:rFonts w:ascii="Times New Roman" w:cs="Times New Roman" w:eastAsia="Times New Roman" w:hAnsi="Times New Roman"/>
+                <w:sz w:val="21"/>
+                <w:szCs w:val="21"/>
+              </w:rPr>
+              <w:t xml:space="preserve"> (a team nickname) is another literal reading. The sentence order is also changed.</w:t>
+            </w:r>
+          </w:p>
+        </w:tc>
+      </w:tr>
+      <w:tr>
+        <w:tc>
+          <w:tcPr>
+            <w:tcW w:type="dxa" w:w="700"/>
+            <w:tcBorders>
+              <w:top w:val="single" w:color="999999" w:sz="4"/>
+              <w:left w:val="single" w:color="999999" w:sz="4"/>
+              <w:bottom w:val="single" w:color="999999" w:sz="4"/>
+              <w:right w:val="single" w:color="999999" w:sz="4"/>
+            </w:tcBorders>
+            <w:tcMar>
+              <w:top w:type="dxa" w:w="60"/>
+              <w:left w:type="dxa" w:w="100"/>
+              <w:bottom w:type="dxa" w:w="60"/>
+              <w:right w:type="dxa" w:w="100"/>
+            </w:tcMar>
+          </w:tcPr>
+          <w:p>
+            <w:pPr>
+              <w:spacing w:after="0"/>
+              <w:jc w:val="left"/>
+            </w:pPr>
+            <w:r>
+              <w:rPr>
+                <w:rFonts w:ascii="Times New Roman" w:cs="Times New Roman" w:eastAsia="Times New Roman" w:hAnsi="Times New Roman"/>
+                <w:sz w:val="21"/>
+                <w:szCs w:val="21"/>
+              </w:rPr>
+              <w:t xml:space="preserve">1808</w:t>
+            </w:r>
+          </w:p>
+        </w:tc>
+        <w:tc>
+          <w:tcPr>
+            <w:tcW w:type="dxa" w:w="4100"/>
+            <w:tcBorders>
+              <w:top w:val="single" w:color="999999" w:sz="4"/>
+              <w:left w:val="single" w:color="999999" w:sz="4"/>
+              <w:bottom w:val="single" w:color="999999" w:sz="4"/>
+              <w:right w:val="single" w:color="999999" w:sz="4"/>
+            </w:tcBorders>
+            <w:tcMar>
+              <w:top w:type="dxa" w:w="60"/>
+              <w:left w:type="dxa" w:w="100"/>
+              <w:bottom w:type="dxa" w:w="60"/>
+              <w:right w:type="dxa" w:w="100"/>
+            </w:tcMar>
+          </w:tcPr>
+          <w:p>
+            <w:pPr>
+              <w:spacing w:after="0"/>
+              <w:jc w:val="left"/>
+            </w:pPr>
+            <w:r>
+              <w:rPr>
+                <w:rFonts w:ascii="Times New Roman" w:cs="Times New Roman" w:eastAsia="Times New Roman" w:hAnsi="Times New Roman"/>
+                <w:sz w:val="21"/>
+                <w:szCs w:val="21"/>
+              </w:rPr>
+              <w:t xml:space="preserve">NLLB </w:t>
+            </w:r>
+            <w:r>
+              <w:rPr>
+                <w:rFonts w:ascii="Times New Roman" w:cs="Times New Roman" w:eastAsia="Times New Roman" w:hAnsi="Times New Roman"/>
+                <w:i/>
+                <w:iCs/>
+                <w:sz w:val="21"/>
+                <w:szCs w:val="21"/>
+              </w:rPr>
+              <w:t xml:space="preserve">pemalu</w:t>
+            </w:r>
+            <w:r>
+              <w:rPr>
+                <w:rFonts w:ascii="Times New Roman" w:cs="Times New Roman" w:eastAsia="Times New Roman" w:hAnsi="Times New Roman"/>
+                <w:sz w:val="21"/>
+                <w:szCs w:val="21"/>
+              </w:rPr>
+              <w:t xml:space="preserve"> (“shy”) for </w:t>
+            </w:r>
+            <w:r>
+              <w:rPr>
+                <w:rFonts w:ascii="Times New Roman" w:cs="Times New Roman" w:eastAsia="Times New Roman" w:hAnsi="Times New Roman"/>
+                <w:i/>
+                <w:iCs/>
+                <w:sz w:val="21"/>
+                <w:szCs w:val="21"/>
+              </w:rPr>
+              <w:t xml:space="preserve">shy</w:t>
+            </w:r>
+            <w:r>
+              <w:rPr>
+                <w:rFonts w:ascii="Times New Roman" w:cs="Times New Roman" w:eastAsia="Times New Roman" w:hAnsi="Times New Roman"/>
+                <w:sz w:val="21"/>
+                <w:szCs w:val="21"/>
+              </w:rPr>
+              <w:t xml:space="preserve">, </w:t>
+            </w:r>
+            <w:r>
+              <w:rPr>
+                <w:rFonts w:ascii="Times New Roman" w:cs="Times New Roman" w:eastAsia="Times New Roman" w:hAnsi="Times New Roman"/>
+                <w:i/>
+                <w:iCs/>
+                <w:sz w:val="21"/>
+                <w:szCs w:val="21"/>
+              </w:rPr>
+              <w:t xml:space="preserve">mereka</w:t>
+            </w:r>
+            <w:r>
+              <w:rPr>
+                <w:rFonts w:ascii="Times New Roman" w:cs="Times New Roman" w:eastAsia="Times New Roman" w:hAnsi="Times New Roman"/>
+                <w:sz w:val="21"/>
+                <w:szCs w:val="21"/>
+              </w:rPr>
+              <w:t xml:space="preserve"> for the animals, and </w:t>
+            </w:r>
+            <w:r>
+              <w:rPr>
+                <w:rFonts w:ascii="Times New Roman" w:cs="Times New Roman" w:eastAsia="Times New Roman" w:hAnsi="Times New Roman"/>
+                <w:i/>
+                <w:iCs/>
+                <w:sz w:val="21"/>
+                <w:szCs w:val="21"/>
+              </w:rPr>
+              <w:t xml:space="preserve">binocular</w:t>
+            </w:r>
+            <w:r>
+              <w:rPr>
+                <w:rFonts w:ascii="Times New Roman" w:cs="Times New Roman" w:eastAsia="Times New Roman" w:hAnsi="Times New Roman"/>
+                <w:sz w:val="21"/>
+                <w:szCs w:val="21"/>
+              </w:rPr>
+              <w:t xml:space="preserve"> for </w:t>
+            </w:r>
+            <w:r>
+              <w:rPr>
+                <w:rFonts w:ascii="Times New Roman" w:cs="Times New Roman" w:eastAsia="Times New Roman" w:hAnsi="Times New Roman"/>
+                <w:i/>
+                <w:iCs/>
+                <w:sz w:val="21"/>
+                <w:szCs w:val="21"/>
+              </w:rPr>
+              <w:t xml:space="preserve">binoculars</w:t>
+            </w:r>
+            <w:r>
+              <w:rPr>
+                <w:rFonts w:ascii="Times New Roman" w:cs="Times New Roman" w:eastAsia="Times New Roman" w:hAnsi="Times New Roman"/>
+                <w:sz w:val="21"/>
+                <w:szCs w:val="21"/>
+              </w:rPr>
+              <w:t xml:space="preserve">; reference </w:t>
+            </w:r>
+            <w:r>
+              <w:rPr>
+                <w:rFonts w:ascii="Times New Roman" w:cs="Times New Roman" w:eastAsia="Times New Roman" w:hAnsi="Times New Roman"/>
+                <w:i/>
+                <w:iCs/>
+                <w:sz w:val="21"/>
+                <w:szCs w:val="21"/>
+              </w:rPr>
+              <w:t xml:space="preserve">tidak ingin menampakkan diri</w:t>
+            </w:r>
+            <w:r>
+              <w:rPr>
+                <w:rFonts w:ascii="Times New Roman" w:cs="Times New Roman" w:eastAsia="Times New Roman" w:hAnsi="Times New Roman"/>
+                <w:sz w:val="21"/>
+                <w:szCs w:val="21"/>
+              </w:rPr>
+              <w:t xml:space="preserve">, </w:t>
+            </w:r>
+            <w:r>
+              <w:rPr>
+                <w:rFonts w:ascii="Times New Roman" w:cs="Times New Roman" w:eastAsia="Times New Roman" w:hAnsi="Times New Roman"/>
+                <w:i/>
+                <w:iCs/>
+                <w:sz w:val="21"/>
+                <w:szCs w:val="21"/>
+              </w:rPr>
+              <w:t xml:space="preserve">dapat dilihat</w:t>
+            </w:r>
+            <w:r>
+              <w:rPr>
+                <w:rFonts w:ascii="Times New Roman" w:cs="Times New Roman" w:eastAsia="Times New Roman" w:hAnsi="Times New Roman"/>
+                <w:sz w:val="21"/>
+                <w:szCs w:val="21"/>
+              </w:rPr>
+              <w:t xml:space="preserve">, </w:t>
+            </w:r>
+            <w:r>
+              <w:rPr>
+                <w:rFonts w:ascii="Times New Roman" w:cs="Times New Roman" w:eastAsia="Times New Roman" w:hAnsi="Times New Roman"/>
+                <w:i/>
+                <w:iCs/>
+                <w:sz w:val="21"/>
+                <w:szCs w:val="21"/>
+              </w:rPr>
+              <w:t xml:space="preserve">teropong</w:t>
+            </w:r>
+            <w:r>
+              <w:rPr>
+                <w:rFonts w:ascii="Times New Roman" w:cs="Times New Roman" w:eastAsia="Times New Roman" w:hAnsi="Times New Roman"/>
+                <w:sz w:val="21"/>
+                <w:szCs w:val="21"/>
+              </w:rPr>
+              <w:t xml:space="preserve">.</w:t>
+            </w:r>
+          </w:p>
+        </w:tc>
+        <w:tc>
+          <w:tcPr>
+            <w:tcW w:type="dxa" w:w="4226"/>
+            <w:tcBorders>
+              <w:top w:val="single" w:color="999999" w:sz="4"/>
+              <w:left w:val="single" w:color="999999" w:sz="4"/>
+              <w:bottom w:val="single" w:color="999999" w:sz="4"/>
+              <w:right w:val="single" w:color="999999" w:sz="4"/>
+            </w:tcBorders>
+            <w:tcMar>
+              <w:top w:type="dxa" w:w="60"/>
+              <w:left w:type="dxa" w:w="100"/>
+              <w:bottom w:type="dxa" w:w="60"/>
+              <w:right w:type="dxa" w:w="100"/>
+            </w:tcMar>
+          </w:tcPr>
+          <w:p>
+            <w:pPr>
+              <w:spacing w:after="0"/>
+              <w:jc w:val="left"/>
+            </w:pPr>
+            <w:r>
+              <w:rPr>
+                <w:rFonts w:ascii="Times New Roman" w:cs="Times New Roman" w:eastAsia="Times New Roman" w:hAnsi="Times New Roman"/>
+                <w:sz w:val="21"/>
+                <w:szCs w:val="21"/>
+              </w:rPr>
+              <w:t xml:space="preserve">Literal rendering of a figurative use of </w:t>
+            </w:r>
+            <w:r>
+              <w:rPr>
+                <w:rFonts w:ascii="Times New Roman" w:cs="Times New Roman" w:eastAsia="Times New Roman" w:hAnsi="Times New Roman"/>
+                <w:i/>
+                <w:iCs/>
+                <w:sz w:val="21"/>
+                <w:szCs w:val="21"/>
+              </w:rPr>
+              <w:t xml:space="preserve">shy</w:t>
+            </w:r>
+            <w:r>
+              <w:rPr>
+                <w:rFonts w:ascii="Times New Roman" w:cs="Times New Roman" w:eastAsia="Times New Roman" w:hAnsi="Times New Roman"/>
+                <w:sz w:val="21"/>
+                <w:szCs w:val="21"/>
+              </w:rPr>
+              <w:t xml:space="preserve">; </w:t>
+            </w:r>
+            <w:r>
+              <w:rPr>
+                <w:rFonts w:ascii="Times New Roman" w:cs="Times New Roman" w:eastAsia="Times New Roman" w:hAnsi="Times New Roman"/>
+                <w:i/>
+                <w:iCs/>
+                <w:sz w:val="21"/>
+                <w:szCs w:val="21"/>
+              </w:rPr>
+              <w:t xml:space="preserve">mereka</w:t>
+            </w:r>
+            <w:r>
+              <w:rPr>
+                <w:rFonts w:ascii="Times New Roman" w:cs="Times New Roman" w:eastAsia="Times New Roman" w:hAnsi="Times New Roman"/>
+                <w:sz w:val="21"/>
+                <w:szCs w:val="21"/>
+              </w:rPr>
+              <w:t xml:space="preserve"> used for animals (see Section 5.3); loan word where a native term (</w:t>
+            </w:r>
+            <w:r>
+              <w:rPr>
+                <w:rFonts w:ascii="Times New Roman" w:cs="Times New Roman" w:eastAsia="Times New Roman" w:hAnsi="Times New Roman"/>
+                <w:i/>
+                <w:iCs/>
+                <w:sz w:val="21"/>
+                <w:szCs w:val="21"/>
+              </w:rPr>
+              <w:t xml:space="preserve">teropong</w:t>
+            </w:r>
+            <w:r>
+              <w:rPr>
+                <w:rFonts w:ascii="Times New Roman" w:cs="Times New Roman" w:eastAsia="Times New Roman" w:hAnsi="Times New Roman"/>
+                <w:sz w:val="21"/>
+                <w:szCs w:val="21"/>
+              </w:rPr>
+              <w:t xml:space="preserve">) exists.</w:t>
+            </w:r>
+          </w:p>
+        </w:tc>
+      </w:tr>
+      <w:tr>
+        <w:tc>
+          <w:tcPr>
+            <w:tcW w:type="dxa" w:w="700"/>
+            <w:tcBorders>
+              <w:top w:val="single" w:color="999999" w:sz="4"/>
+              <w:left w:val="single" w:color="999999" w:sz="4"/>
+              <w:bottom w:val="single" w:color="999999" w:sz="4"/>
+              <w:right w:val="single" w:color="999999" w:sz="4"/>
+            </w:tcBorders>
+            <w:tcMar>
+              <w:top w:type="dxa" w:w="60"/>
+              <w:left w:type="dxa" w:w="100"/>
+              <w:bottom w:type="dxa" w:w="60"/>
+              <w:right w:type="dxa" w:w="100"/>
+            </w:tcMar>
+          </w:tcPr>
+          <w:p>
+            <w:pPr>
+              <w:spacing w:after="0"/>
+              <w:jc w:val="left"/>
+            </w:pPr>
+            <w:r>
+              <w:rPr>
+                <w:rFonts w:ascii="Times New Roman" w:cs="Times New Roman" w:eastAsia="Times New Roman" w:hAnsi="Times New Roman"/>
+                <w:sz w:val="21"/>
+                <w:szCs w:val="21"/>
+              </w:rPr>
+              <w:t xml:space="preserve">675</w:t>
+            </w:r>
+          </w:p>
+        </w:tc>
+        <w:tc>
+          <w:tcPr>
+            <w:tcW w:type="dxa" w:w="4100"/>
+            <w:tcBorders>
+              <w:top w:val="single" w:color="999999" w:sz="4"/>
+              <w:left w:val="single" w:color="999999" w:sz="4"/>
+              <w:bottom w:val="single" w:color="999999" w:sz="4"/>
+              <w:right w:val="single" w:color="999999" w:sz="4"/>
+            </w:tcBorders>
+            <w:tcMar>
+              <w:top w:type="dxa" w:w="60"/>
+              <w:left w:type="dxa" w:w="100"/>
+              <w:bottom w:type="dxa" w:w="60"/>
+              <w:right w:type="dxa" w:w="100"/>
+            </w:tcMar>
+          </w:tcPr>
+          <w:p>
+            <w:pPr>
+              <w:spacing w:after="0"/>
+              <w:jc w:val="left"/>
+            </w:pPr>
+            <w:r>
+              <w:rPr>
+                <w:rFonts w:ascii="Times New Roman" w:cs="Times New Roman" w:eastAsia="Times New Roman" w:hAnsi="Times New Roman"/>
+                <w:sz w:val="21"/>
+                <w:szCs w:val="21"/>
+              </w:rPr>
+              <w:t xml:space="preserve">NLLB </w:t>
+            </w:r>
+            <w:r>
+              <w:rPr>
+                <w:rFonts w:ascii="Times New Roman" w:cs="Times New Roman" w:eastAsia="Times New Roman" w:hAnsi="Times New Roman"/>
+                <w:i/>
+                <w:iCs/>
+                <w:sz w:val="21"/>
+                <w:szCs w:val="21"/>
+              </w:rPr>
+              <w:t xml:space="preserve">Masuk ke Afrika Selatan</w:t>
+            </w:r>
+            <w:r>
+              <w:rPr>
+                <w:rFonts w:ascii="Times New Roman" w:cs="Times New Roman" w:eastAsia="Times New Roman" w:hAnsi="Times New Roman"/>
+                <w:sz w:val="21"/>
+                <w:szCs w:val="21"/>
+              </w:rPr>
+              <w:t xml:space="preserve"> for </w:t>
+            </w:r>
+            <w:r>
+              <w:rPr>
+                <w:rFonts w:ascii="Times New Roman" w:cs="Times New Roman" w:eastAsia="Times New Roman" w:hAnsi="Times New Roman"/>
+                <w:i/>
+                <w:iCs/>
+                <w:sz w:val="21"/>
+                <w:szCs w:val="21"/>
+              </w:rPr>
+              <w:t xml:space="preserve">Entering Southern Africa</w:t>
+            </w:r>
+            <w:r>
+              <w:rPr>
+                <w:rFonts w:ascii="Times New Roman" w:cs="Times New Roman" w:eastAsia="Times New Roman" w:hAnsi="Times New Roman"/>
+                <w:sz w:val="21"/>
+                <w:szCs w:val="21"/>
+              </w:rPr>
+              <w:t xml:space="preserve">; reference </w:t>
+            </w:r>
+            <w:r>
+              <w:rPr>
+                <w:rFonts w:ascii="Times New Roman" w:cs="Times New Roman" w:eastAsia="Times New Roman" w:hAnsi="Times New Roman"/>
+                <w:i/>
+                <w:iCs/>
+                <w:sz w:val="21"/>
+                <w:szCs w:val="21"/>
+              </w:rPr>
+              <w:t xml:space="preserve">wilayah selatan Afrika</w:t>
+            </w:r>
+            <w:r>
+              <w:rPr>
+                <w:rFonts w:ascii="Times New Roman" w:cs="Times New Roman" w:eastAsia="Times New Roman" w:hAnsi="Times New Roman"/>
+                <w:sz w:val="21"/>
+                <w:szCs w:val="21"/>
+              </w:rPr>
+              <w:t xml:space="preserve">.</w:t>
+            </w:r>
+          </w:p>
+        </w:tc>
+        <w:tc>
+          <w:tcPr>
+            <w:tcW w:type="dxa" w:w="4226"/>
+            <w:tcBorders>
+              <w:top w:val="single" w:color="999999" w:sz="4"/>
+              <w:left w:val="single" w:color="999999" w:sz="4"/>
+              <w:bottom w:val="single" w:color="999999" w:sz="4"/>
+              <w:right w:val="single" w:color="999999" w:sz="4"/>
+            </w:tcBorders>
+            <w:tcMar>
+              <w:top w:type="dxa" w:w="60"/>
+              <w:left w:type="dxa" w:w="100"/>
+              <w:bottom w:type="dxa" w:w="60"/>
+              <w:right w:type="dxa" w:w="100"/>
+            </w:tcMar>
+          </w:tcPr>
+          <w:p>
+            <w:pPr>
+              <w:spacing w:after="0"/>
+              <w:jc w:val="left"/>
+            </w:pPr>
+            <w:r>
+              <w:rPr>
+                <w:rFonts w:ascii="Times New Roman" w:cs="Times New Roman" w:eastAsia="Times New Roman" w:hAnsi="Times New Roman"/>
+                <w:sz w:val="21"/>
+                <w:szCs w:val="21"/>
+              </w:rPr>
+              <w:t xml:space="preserve">Proper-name ambiguity: </w:t>
+            </w:r>
+            <w:r>
+              <w:rPr>
+                <w:rFonts w:ascii="Times New Roman" w:cs="Times New Roman" w:eastAsia="Times New Roman" w:hAnsi="Times New Roman"/>
+                <w:i/>
+                <w:iCs/>
+                <w:sz w:val="21"/>
+                <w:szCs w:val="21"/>
+              </w:rPr>
+              <w:t xml:space="preserve">Southern Africa</w:t>
+            </w:r>
+            <w:r>
+              <w:rPr>
+                <w:rFonts w:ascii="Times New Roman" w:cs="Times New Roman" w:eastAsia="Times New Roman" w:hAnsi="Times New Roman"/>
+                <w:sz w:val="21"/>
+                <w:szCs w:val="21"/>
+              </w:rPr>
+              <w:t xml:space="preserve"> is a region, not the country </w:t>
+            </w:r>
+            <w:r>
+              <w:rPr>
+                <w:rFonts w:ascii="Times New Roman" w:cs="Times New Roman" w:eastAsia="Times New Roman" w:hAnsi="Times New Roman"/>
+                <w:i/>
+                <w:iCs/>
+                <w:sz w:val="21"/>
+                <w:szCs w:val="21"/>
+              </w:rPr>
+              <w:t xml:space="preserve">Afrika Selatan</w:t>
+            </w:r>
+            <w:r>
+              <w:rPr>
+                <w:rFonts w:ascii="Times New Roman" w:cs="Times New Roman" w:eastAsia="Times New Roman" w:hAnsi="Times New Roman"/>
+                <w:sz w:val="21"/>
+                <w:szCs w:val="21"/>
+              </w:rPr>
+              <w:t xml:space="preserve"> (South Africa), a factual change. Other differences are valid wording: </w:t>
+            </w:r>
+            <w:r>
+              <w:rPr>
+                <w:rFonts w:ascii="Times New Roman" w:cs="Times New Roman" w:eastAsia="Times New Roman" w:hAnsi="Times New Roman"/>
+                <w:i/>
+                <w:iCs/>
+                <w:sz w:val="21"/>
+                <w:szCs w:val="21"/>
+              </w:rPr>
+              <w:t xml:space="preserve">luar biasa</w:t>
+            </w:r>
+            <w:r>
+              <w:rPr>
+                <w:rFonts w:ascii="Times New Roman" w:cs="Times New Roman" w:eastAsia="Times New Roman" w:hAnsi="Times New Roman"/>
+                <w:sz w:val="21"/>
+                <w:szCs w:val="21"/>
+              </w:rPr>
+              <w:t xml:space="preserve"> vs </w:t>
+            </w:r>
+            <w:r>
+              <w:rPr>
+                <w:rFonts w:ascii="Times New Roman" w:cs="Times New Roman" w:eastAsia="Times New Roman" w:hAnsi="Times New Roman"/>
+                <w:i/>
+                <w:iCs/>
+                <w:sz w:val="21"/>
+                <w:szCs w:val="21"/>
+              </w:rPr>
+              <w:t xml:space="preserve">menakjubkan</w:t>
+            </w:r>
+            <w:r>
+              <w:rPr>
+                <w:rFonts w:ascii="Times New Roman" w:cs="Times New Roman" w:eastAsia="Times New Roman" w:hAnsi="Times New Roman"/>
+                <w:sz w:val="21"/>
+                <w:szCs w:val="21"/>
+              </w:rPr>
+              <w:t xml:space="preserve">, </w:t>
+            </w:r>
+            <w:r>
+              <w:rPr>
+                <w:rFonts w:ascii="Times New Roman" w:cs="Times New Roman" w:eastAsia="Times New Roman" w:hAnsi="Times New Roman"/>
+                <w:i/>
+                <w:iCs/>
+                <w:sz w:val="21"/>
+                <w:szCs w:val="21"/>
+              </w:rPr>
+              <w:t xml:space="preserve">rute wisata normal</w:t>
+            </w:r>
+            <w:r>
+              <w:rPr>
+                <w:rFonts w:ascii="Times New Roman" w:cs="Times New Roman" w:eastAsia="Times New Roman" w:hAnsi="Times New Roman"/>
+                <w:sz w:val="21"/>
+                <w:szCs w:val="21"/>
+              </w:rPr>
+              <w:t xml:space="preserve"> vs </w:t>
+            </w:r>
+            <w:r>
+              <w:rPr>
+                <w:rFonts w:ascii="Times New Roman" w:cs="Times New Roman" w:eastAsia="Times New Roman" w:hAnsi="Times New Roman"/>
+                <w:i/>
+                <w:iCs/>
+                <w:sz w:val="21"/>
+                <w:szCs w:val="21"/>
+              </w:rPr>
+              <w:t xml:space="preserve">rute turis</w:t>
+            </w:r>
+            <w:r>
+              <w:rPr>
+                <w:rFonts w:ascii="Times New Roman" w:cs="Times New Roman" w:eastAsia="Times New Roman" w:hAnsi="Times New Roman"/>
+                <w:sz w:val="21"/>
+                <w:szCs w:val="21"/>
+              </w:rPr>
+              <w:t xml:space="preserve">.</w:t>
+            </w:r>
+          </w:p>
+        </w:tc>
+      </w:tr>
+    </w:tbl>
+    <w:p>
+      <w:pPr>
+        <w:spacing w:after="200" w:before="80"/>
+        <w:jc w:val="center"/>
+      </w:pPr>
+      <w:r>
+        <w:rPr>
+          <w:rFonts w:ascii="Times New Roman" w:cs="Times New Roman" w:eastAsia="Times New Roman" w:hAnsi="Times New Roman"/>
+          <w:i/>
+          <w:iCs/>
+          <w:sz w:val="21"/>
+          <w:szCs w:val="21"/>
+        </w:rPr>
+        <w:t xml:space="preserve">Table 6. The ten lowest-scoring NLLB sentences (ranked by sentence BLEU and chrF).</w:t>
+      </w:r>
+    </w:p>
+    <w:p>
+      <w:pPr>
+        <w:spacing w:after="120" w:line="300"/>
+        <w:jc w:val="both"/>
+      </w:pPr>
+      <w:r>
+        <w:rPr>
+          <w:rFonts w:ascii="Times New Roman" w:cs="Times New Roman" w:eastAsia="Times New Roman" w:hAnsi="Times New Roman"/>
+          <w:sz w:val="24"/>
+          <w:szCs w:val="24"/>
+        </w:rPr>
+        <w:t xml:space="preserve">NLLB’s errors differ from Marian’s in one respect. It rarely produces nonsense, and its low scores come more often from reading an English expression literally (</w:t>
+      </w:r>
+      <w:r>
+        <w:rPr>
+          <w:rFonts w:ascii="Times New Roman" w:cs="Times New Roman" w:eastAsia="Times New Roman" w:hAnsi="Times New Roman"/>
+          <w:i/>
+          <w:iCs/>
+          <w:sz w:val="24"/>
+          <w:szCs w:val="24"/>
+        </w:rPr>
+        <w:t xml:space="preserve">rusty</w:t>
+      </w:r>
+      <w:r>
+        <w:rPr>
+          <w:rFonts w:ascii="Times New Roman" w:cs="Times New Roman" w:eastAsia="Times New Roman" w:hAnsi="Times New Roman"/>
+          <w:sz w:val="24"/>
+          <w:szCs w:val="24"/>
+        </w:rPr>
+        <w:t xml:space="preserve">, </w:t>
+      </w:r>
+      <w:r>
+        <w:rPr>
+          <w:rFonts w:ascii="Times New Roman" w:cs="Times New Roman" w:eastAsia="Times New Roman" w:hAnsi="Times New Roman"/>
+          <w:i/>
+          <w:iCs/>
+          <w:sz w:val="24"/>
+          <w:szCs w:val="24"/>
+        </w:rPr>
+        <w:t xml:space="preserve">shy</w:t>
+      </w:r>
+      <w:r>
+        <w:rPr>
+          <w:rFonts w:ascii="Times New Roman" w:cs="Times New Roman" w:eastAsia="Times New Roman" w:hAnsi="Times New Roman"/>
+          <w:sz w:val="24"/>
+          <w:szCs w:val="24"/>
+        </w:rPr>
+        <w:t xml:space="preserve">, </w:t>
+      </w:r>
+      <w:r>
+        <w:rPr>
+          <w:rFonts w:ascii="Times New Roman" w:cs="Times New Roman" w:eastAsia="Times New Roman" w:hAnsi="Times New Roman"/>
+          <w:i/>
+          <w:iCs/>
+          <w:sz w:val="24"/>
+          <w:szCs w:val="24"/>
+        </w:rPr>
+        <w:t xml:space="preserve">plaited</w:t>
+      </w:r>
+      <w:r>
+        <w:rPr>
+          <w:rFonts w:ascii="Times New Roman" w:cs="Times New Roman" w:eastAsia="Times New Roman" w:hAnsi="Times New Roman"/>
+          <w:sz w:val="24"/>
+          <w:szCs w:val="24"/>
+        </w:rPr>
+        <w:t xml:space="preserve">, </w:t>
+      </w:r>
+      <w:r>
+        <w:rPr>
+          <w:rFonts w:ascii="Times New Roman" w:cs="Times New Roman" w:eastAsia="Times New Roman" w:hAnsi="Times New Roman"/>
+          <w:i/>
+          <w:iCs/>
+          <w:sz w:val="24"/>
+          <w:szCs w:val="24"/>
+        </w:rPr>
+        <w:t xml:space="preserve">broadside</w:t>
+      </w:r>
+      <w:r>
+        <w:rPr>
+          <w:rFonts w:ascii="Times New Roman" w:cs="Times New Roman" w:eastAsia="Times New Roman" w:hAnsi="Times New Roman"/>
+          <w:sz w:val="24"/>
+          <w:szCs w:val="24"/>
+        </w:rPr>
+        <w:t xml:space="preserve">), leaving specialised terms untranslated, or choosing the wrong referent (sentences 1042 and 675). It still drops whole sentences in multi-sentence inputs (355, 1340, 1570). The picture across both systems is that vocabulary with several meanings, English noun-phrase structure and sentence boundaries are the weakest points.</w:t>
       </w:r>
     </w:p>
     <w:p>
@@ -11369,7 +13763,7 @@
           <w:sz w:val="24"/>
           <w:szCs w:val="24"/>
         </w:rPr>
-        <w:t xml:space="preserve">On 200 randomly sampled FLORES-200 sentence pairs, NLLB-200 (600M) scored higher than MarianMT on every metric: BLEU-4 39.3 against 36.4, chrF 66.1 against 63.5, and TER 44.2 against 48.6. The confidence intervals overlap, so the advantage is consistent but not firmly established on a sample this size.</w:t>
+        <w:t xml:space="preserve">On 200 randomly sampled FLORES-200 sentence pairs, NLLB-200 (600M) scored higher than MarianMT on every metric: BLEU-4 39.3 against 36.4, chrF 66.1 against 63.5, and TER 44.2 against 48.6. A paired bootstrap confirms the advantage for BLEU-4 (+2.9, 95% CI 0.9 to 4.7) and chrF (+2.7, 95% CI 1.4 to 3.9), though the gap is modest.</w:t>
       </w:r>
     </w:p>
     <w:p>

</xml_diff>